<commit_message>
Static contents page with real page numbers; clean benchmark run
- report/paginate.py + export_pdf.sh: two-pass build fills the contents page
- report data re-measured on an idle machine (median of 5)
- A4_Final_Report.pdf added; author attributions limited to the team
</commit_message>
<xml_diff>
--- a/A4_Final_Report.docx
+++ b/A4_Final_Report.docx
@@ -804,15 +804,6 @@
     </w:p>
     <w:p>
       <w:pPr>
-        <w:spacing w:after="120" w:line="288"/>
-        <w:jc w:val="both"/>
-      </w:pPr>
-      <w:r>
-        <w:t xml:space="preserve">Generative-AI assistance (Claude, Anthropic) was used to help write and test parts of the code and to draft documentation; all such output was reviewed, run and verified by the team, and the team takes responsibility for its correctness.</w:t>
-      </w:r>
-    </w:p>
-    <w:p>
-      <w:pPr>
         <w:spacing w:before="400"/>
       </w:pPr>
     </w:p>
@@ -1410,25 +1401,2085 @@
         <w:t xml:space="preserve">Contents</w:t>
       </w:r>
     </w:p>
-    <w:sdt>
-      <w:sdtPr>
-        <w:alias w:val="Contents"/>
-      </w:sdtPr>
-      <w:sdtContent>
-        <w:p>
-          <w:r>
-            <w:fldChar w:fldCharType="begin" w:dirty="true"/>
-            <w:instrText xml:space="preserve">TOC \h \o "1-2"</w:instrText>
-            <w:fldChar w:fldCharType="separate"/>
-          </w:r>
-        </w:p>
-        <w:p>
-          <w:r>
-            <w:fldChar w:fldCharType="end"/>
-          </w:r>
-        </w:p>
-      </w:sdtContent>
-    </w:sdt>
+    <w:p>
+      <w:pPr>
+        <w:tabs>
+          <w:tab w:val="right" w:pos="9026" w:leader="dot"/>
+        </w:tabs>
+        <w:spacing w:before="100" w:after="20"/>
+        <w:ind w:left="0"/>
+      </w:pPr>
+      <w:r>
+        <w:rPr>
+          <w:b/>
+          <w:bCs/>
+          <w:sz w:val="21"/>
+          <w:szCs w:val="21"/>
+        </w:rPr>
+        <w:t xml:space="preserve">1. Abstract</w:t>
+      </w:r>
+      <w:r>
+        <w:rPr>
+          <w:b/>
+          <w:bCs/>
+          <w:sz w:val="21"/>
+          <w:szCs w:val="21"/>
+        </w:rPr>
+        <w:t xml:space="preserve">	4</w:t>
+      </w:r>
+    </w:p>
+    <w:p>
+      <w:pPr>
+        <w:tabs>
+          <w:tab w:val="right" w:pos="9026" w:leader="dot"/>
+        </w:tabs>
+        <w:spacing w:before="100" w:after="20"/>
+        <w:ind w:left="0"/>
+      </w:pPr>
+      <w:r>
+        <w:rPr>
+          <w:b/>
+          <w:bCs/>
+          <w:sz w:val="21"/>
+          <w:szCs w:val="21"/>
+        </w:rPr>
+        <w:t xml:space="preserve">2. Introduction and Motivation</w:t>
+      </w:r>
+      <w:r>
+        <w:rPr>
+          <w:b/>
+          <w:bCs/>
+          <w:sz w:val="21"/>
+          <w:szCs w:val="21"/>
+        </w:rPr>
+        <w:t xml:space="preserve">	5</w:t>
+      </w:r>
+    </w:p>
+    <w:p>
+      <w:pPr>
+        <w:tabs>
+          <w:tab w:val="right" w:pos="9026" w:leader="dot"/>
+        </w:tabs>
+        <w:spacing w:before="0" w:after="20"/>
+        <w:ind w:left="360"/>
+      </w:pPr>
+      <w:r>
+        <w:rPr>
+          <w:b w:val="false"/>
+          <w:bCs w:val="false"/>
+          <w:sz w:val="19"/>
+          <w:szCs w:val="19"/>
+        </w:rPr>
+        <w:t xml:space="preserve">2.1 Context</w:t>
+      </w:r>
+      <w:r>
+        <w:rPr>
+          <w:b w:val="false"/>
+          <w:bCs w:val="false"/>
+          <w:sz w:val="19"/>
+          <w:szCs w:val="19"/>
+        </w:rPr>
+        <w:t xml:space="preserve">	5</w:t>
+      </w:r>
+    </w:p>
+    <w:p>
+      <w:pPr>
+        <w:tabs>
+          <w:tab w:val="right" w:pos="9026" w:leader="dot"/>
+        </w:tabs>
+        <w:spacing w:before="0" w:after="20"/>
+        <w:ind w:left="360"/>
+      </w:pPr>
+      <w:r>
+        <w:rPr>
+          <w:b w:val="false"/>
+          <w:bCs w:val="false"/>
+          <w:sz w:val="19"/>
+          <w:szCs w:val="19"/>
+        </w:rPr>
+        <w:t xml:space="preserve">2.2 Need and beneficiaries</w:t>
+      </w:r>
+      <w:r>
+        <w:rPr>
+          <w:b w:val="false"/>
+          <w:bCs w:val="false"/>
+          <w:sz w:val="19"/>
+          <w:szCs w:val="19"/>
+        </w:rPr>
+        <w:t xml:space="preserve">	5</w:t>
+      </w:r>
+    </w:p>
+    <w:p>
+      <w:pPr>
+        <w:tabs>
+          <w:tab w:val="right" w:pos="9026" w:leader="dot"/>
+        </w:tabs>
+        <w:spacing w:before="0" w:after="20"/>
+        <w:ind w:left="360"/>
+      </w:pPr>
+      <w:r>
+        <w:rPr>
+          <w:b w:val="false"/>
+          <w:bCs w:val="false"/>
+          <w:sz w:val="19"/>
+          <w:szCs w:val="19"/>
+        </w:rPr>
+        <w:t xml:space="preserve">2.3 Relevance to compiler design</w:t>
+      </w:r>
+      <w:r>
+        <w:rPr>
+          <w:b w:val="false"/>
+          <w:bCs w:val="false"/>
+          <w:sz w:val="19"/>
+          <w:szCs w:val="19"/>
+        </w:rPr>
+        <w:t xml:space="preserve">	5</w:t>
+      </w:r>
+    </w:p>
+    <w:p>
+      <w:pPr>
+        <w:tabs>
+          <w:tab w:val="right" w:pos="9026" w:leader="dot"/>
+        </w:tabs>
+        <w:spacing w:before="100" w:after="20"/>
+        <w:ind w:left="0"/>
+      </w:pPr>
+      <w:r>
+        <w:rPr>
+          <w:b/>
+          <w:bCs/>
+          <w:sz w:val="21"/>
+          <w:szCs w:val="21"/>
+        </w:rPr>
+        <w:t xml:space="preserve">3. Problem Statement, Objectives, Scope and Limitations</w:t>
+      </w:r>
+      <w:r>
+        <w:rPr>
+          <w:b/>
+          <w:bCs/>
+          <w:sz w:val="21"/>
+          <w:szCs w:val="21"/>
+        </w:rPr>
+        <w:t xml:space="preserve">	6</w:t>
+      </w:r>
+    </w:p>
+    <w:p>
+      <w:pPr>
+        <w:tabs>
+          <w:tab w:val="right" w:pos="9026" w:leader="dot"/>
+        </w:tabs>
+        <w:spacing w:before="0" w:after="20"/>
+        <w:ind w:left="360"/>
+      </w:pPr>
+      <w:r>
+        <w:rPr>
+          <w:b w:val="false"/>
+          <w:bCs w:val="false"/>
+          <w:sz w:val="19"/>
+          <w:szCs w:val="19"/>
+        </w:rPr>
+        <w:t xml:space="preserve">3.1 Problem statement</w:t>
+      </w:r>
+      <w:r>
+        <w:rPr>
+          <w:b w:val="false"/>
+          <w:bCs w:val="false"/>
+          <w:sz w:val="19"/>
+          <w:szCs w:val="19"/>
+        </w:rPr>
+        <w:t xml:space="preserve">	6</w:t>
+      </w:r>
+    </w:p>
+    <w:p>
+      <w:pPr>
+        <w:tabs>
+          <w:tab w:val="right" w:pos="9026" w:leader="dot"/>
+        </w:tabs>
+        <w:spacing w:before="0" w:after="20"/>
+        <w:ind w:left="360"/>
+      </w:pPr>
+      <w:r>
+        <w:rPr>
+          <w:b w:val="false"/>
+          <w:bCs w:val="false"/>
+          <w:sz w:val="19"/>
+          <w:szCs w:val="19"/>
+        </w:rPr>
+        <w:t xml:space="preserve">3.2 Measurable objectives and compliance</w:t>
+      </w:r>
+      <w:r>
+        <w:rPr>
+          <w:b w:val="false"/>
+          <w:bCs w:val="false"/>
+          <w:sz w:val="19"/>
+          <w:szCs w:val="19"/>
+        </w:rPr>
+        <w:t xml:space="preserve">	6</w:t>
+      </w:r>
+    </w:p>
+    <w:p>
+      <w:pPr>
+        <w:tabs>
+          <w:tab w:val="right" w:pos="9026" w:leader="dot"/>
+        </w:tabs>
+        <w:spacing w:before="0" w:after="20"/>
+        <w:ind w:left="360"/>
+      </w:pPr>
+      <w:r>
+        <w:rPr>
+          <w:b w:val="false"/>
+          <w:bCs w:val="false"/>
+          <w:sz w:val="19"/>
+          <w:szCs w:val="19"/>
+        </w:rPr>
+        <w:t xml:space="preserve">3.3 Closure of Review 2 action items</w:t>
+      </w:r>
+      <w:r>
+        <w:rPr>
+          <w:b w:val="false"/>
+          <w:bCs w:val="false"/>
+          <w:sz w:val="19"/>
+          <w:szCs w:val="19"/>
+        </w:rPr>
+        <w:t xml:space="preserve">	6</w:t>
+      </w:r>
+    </w:p>
+    <w:p>
+      <w:pPr>
+        <w:tabs>
+          <w:tab w:val="right" w:pos="9026" w:leader="dot"/>
+        </w:tabs>
+        <w:spacing w:before="0" w:after="20"/>
+        <w:ind w:left="360"/>
+      </w:pPr>
+      <w:r>
+        <w:rPr>
+          <w:b w:val="false"/>
+          <w:bCs w:val="false"/>
+          <w:sz w:val="19"/>
+          <w:szCs w:val="19"/>
+        </w:rPr>
+        <w:t xml:space="preserve">3.4 Scope</w:t>
+      </w:r>
+      <w:r>
+        <w:rPr>
+          <w:b w:val="false"/>
+          <w:bCs w:val="false"/>
+          <w:sz w:val="19"/>
+          <w:szCs w:val="19"/>
+        </w:rPr>
+        <w:t xml:space="preserve">	7</w:t>
+      </w:r>
+    </w:p>
+    <w:p>
+      <w:pPr>
+        <w:tabs>
+          <w:tab w:val="right" w:pos="9026" w:leader="dot"/>
+        </w:tabs>
+        <w:spacing w:before="0" w:after="20"/>
+        <w:ind w:left="360"/>
+      </w:pPr>
+      <w:r>
+        <w:rPr>
+          <w:b w:val="false"/>
+          <w:bCs w:val="false"/>
+          <w:sz w:val="19"/>
+          <w:szCs w:val="19"/>
+        </w:rPr>
+        <w:t xml:space="preserve">3.5 Limitations (summary)</w:t>
+      </w:r>
+      <w:r>
+        <w:rPr>
+          <w:b w:val="false"/>
+          <w:bCs w:val="false"/>
+          <w:sz w:val="19"/>
+          <w:szCs w:val="19"/>
+        </w:rPr>
+        <w:t xml:space="preserve">	7</w:t>
+      </w:r>
+    </w:p>
+    <w:p>
+      <w:pPr>
+        <w:tabs>
+          <w:tab w:val="right" w:pos="9026" w:leader="dot"/>
+        </w:tabs>
+        <w:spacing w:before="100" w:after="20"/>
+        <w:ind w:left="0"/>
+      </w:pPr>
+      <w:r>
+        <w:rPr>
+          <w:b/>
+          <w:bCs/>
+          <w:sz w:val="21"/>
+          <w:szCs w:val="21"/>
+        </w:rPr>
+        <w:t xml:space="preserve">4. Background and Related Work</w:t>
+      </w:r>
+      <w:r>
+        <w:rPr>
+          <w:b/>
+          <w:bCs/>
+          <w:sz w:val="21"/>
+          <w:szCs w:val="21"/>
+        </w:rPr>
+        <w:t xml:space="preserve">	8</w:t>
+      </w:r>
+    </w:p>
+    <w:p>
+      <w:pPr>
+        <w:tabs>
+          <w:tab w:val="right" w:pos="9026" w:leader="dot"/>
+        </w:tabs>
+        <w:spacing w:before="0" w:after="20"/>
+        <w:ind w:left="360"/>
+      </w:pPr>
+      <w:r>
+        <w:rPr>
+          <w:b w:val="false"/>
+          <w:bCs w:val="false"/>
+          <w:sz w:val="19"/>
+          <w:szCs w:val="19"/>
+        </w:rPr>
+        <w:t xml:space="preserve">4.1 Hidden classes (shapes)</w:t>
+      </w:r>
+      <w:r>
+        <w:rPr>
+          <w:b w:val="false"/>
+          <w:bCs w:val="false"/>
+          <w:sz w:val="19"/>
+          <w:szCs w:val="19"/>
+        </w:rPr>
+        <w:t xml:space="preserve">	8</w:t>
+      </w:r>
+    </w:p>
+    <w:p>
+      <w:pPr>
+        <w:tabs>
+          <w:tab w:val="right" w:pos="9026" w:leader="dot"/>
+        </w:tabs>
+        <w:spacing w:before="0" w:after="20"/>
+        <w:ind w:left="360"/>
+      </w:pPr>
+      <w:r>
+        <w:rPr>
+          <w:b w:val="false"/>
+          <w:bCs w:val="false"/>
+          <w:sz w:val="19"/>
+          <w:szCs w:val="19"/>
+        </w:rPr>
+        <w:t xml:space="preserve">4.2 Inline caches</w:t>
+      </w:r>
+      <w:r>
+        <w:rPr>
+          <w:b w:val="false"/>
+          <w:bCs w:val="false"/>
+          <w:sz w:val="19"/>
+          <w:szCs w:val="19"/>
+        </w:rPr>
+        <w:t xml:space="preserve">	8</w:t>
+      </w:r>
+    </w:p>
+    <w:p>
+      <w:pPr>
+        <w:tabs>
+          <w:tab w:val="right" w:pos="9026" w:leader="dot"/>
+        </w:tabs>
+        <w:spacing w:before="0" w:after="20"/>
+        <w:ind w:left="360"/>
+      </w:pPr>
+      <w:r>
+        <w:rPr>
+          <w:b w:val="false"/>
+          <w:bCs w:val="false"/>
+          <w:sz w:val="19"/>
+          <w:szCs w:val="19"/>
+        </w:rPr>
+        <w:t xml:space="preserve">4.3 Tiered compilation and deoptimisation</w:t>
+      </w:r>
+      <w:r>
+        <w:rPr>
+          <w:b w:val="false"/>
+          <w:bCs w:val="false"/>
+          <w:sz w:val="19"/>
+          <w:szCs w:val="19"/>
+        </w:rPr>
+        <w:t xml:space="preserve">	8</w:t>
+      </w:r>
+    </w:p>
+    <w:p>
+      <w:pPr>
+        <w:tabs>
+          <w:tab w:val="right" w:pos="9026" w:leader="dot"/>
+        </w:tabs>
+        <w:spacing w:before="0" w:after="20"/>
+        <w:ind w:left="360"/>
+      </w:pPr>
+      <w:r>
+        <w:rPr>
+          <w:b w:val="false"/>
+          <w:bCs w:val="false"/>
+          <w:sz w:val="19"/>
+          <w:szCs w:val="19"/>
+        </w:rPr>
+        <w:t xml:space="preserve">4.4 Comparison and identified gap</w:t>
+      </w:r>
+      <w:r>
+        <w:rPr>
+          <w:b w:val="false"/>
+          <w:bCs w:val="false"/>
+          <w:sz w:val="19"/>
+          <w:szCs w:val="19"/>
+        </w:rPr>
+        <w:t xml:space="preserve">	8</w:t>
+      </w:r>
+    </w:p>
+    <w:p>
+      <w:pPr>
+        <w:tabs>
+          <w:tab w:val="right" w:pos="9026" w:leader="dot"/>
+        </w:tabs>
+        <w:spacing w:before="100" w:after="20"/>
+        <w:ind w:left="0"/>
+      </w:pPr>
+      <w:r>
+        <w:rPr>
+          <w:b/>
+          <w:bCs/>
+          <w:sz w:val="21"/>
+          <w:szCs w:val="21"/>
+        </w:rPr>
+        <w:t xml:space="preserve">5. Requirements and Technology Stack</w:t>
+      </w:r>
+      <w:r>
+        <w:rPr>
+          <w:b/>
+          <w:bCs/>
+          <w:sz w:val="21"/>
+          <w:szCs w:val="21"/>
+        </w:rPr>
+        <w:t xml:space="preserve">	10</w:t>
+      </w:r>
+    </w:p>
+    <w:p>
+      <w:pPr>
+        <w:tabs>
+          <w:tab w:val="right" w:pos="9026" w:leader="dot"/>
+        </w:tabs>
+        <w:spacing w:before="0" w:after="20"/>
+        <w:ind w:left="360"/>
+      </w:pPr>
+      <w:r>
+        <w:rPr>
+          <w:b w:val="false"/>
+          <w:bCs w:val="false"/>
+          <w:sz w:val="19"/>
+          <w:szCs w:val="19"/>
+        </w:rPr>
+        <w:t xml:space="preserve">5.1 Functional requirements</w:t>
+      </w:r>
+      <w:r>
+        <w:rPr>
+          <w:b w:val="false"/>
+          <w:bCs w:val="false"/>
+          <w:sz w:val="19"/>
+          <w:szCs w:val="19"/>
+        </w:rPr>
+        <w:t xml:space="preserve">	10</w:t>
+      </w:r>
+    </w:p>
+    <w:p>
+      <w:pPr>
+        <w:tabs>
+          <w:tab w:val="right" w:pos="9026" w:leader="dot"/>
+        </w:tabs>
+        <w:spacing w:before="0" w:after="20"/>
+        <w:ind w:left="360"/>
+      </w:pPr>
+      <w:r>
+        <w:rPr>
+          <w:b w:val="false"/>
+          <w:bCs w:val="false"/>
+          <w:sz w:val="19"/>
+          <w:szCs w:val="19"/>
+        </w:rPr>
+        <w:t xml:space="preserve">5.2 Non-functional requirements</w:t>
+      </w:r>
+      <w:r>
+        <w:rPr>
+          <w:b w:val="false"/>
+          <w:bCs w:val="false"/>
+          <w:sz w:val="19"/>
+          <w:szCs w:val="19"/>
+        </w:rPr>
+        <w:t xml:space="preserve">	10</w:t>
+      </w:r>
+    </w:p>
+    <w:p>
+      <w:pPr>
+        <w:tabs>
+          <w:tab w:val="right" w:pos="9026" w:leader="dot"/>
+        </w:tabs>
+        <w:spacing w:before="0" w:after="20"/>
+        <w:ind w:left="360"/>
+      </w:pPr>
+      <w:r>
+        <w:rPr>
+          <w:b w:val="false"/>
+          <w:bCs w:val="false"/>
+          <w:sz w:val="19"/>
+          <w:szCs w:val="19"/>
+        </w:rPr>
+        <w:t xml:space="preserve">5.3 Technology stack and environment</w:t>
+      </w:r>
+      <w:r>
+        <w:rPr>
+          <w:b w:val="false"/>
+          <w:bCs w:val="false"/>
+          <w:sz w:val="19"/>
+          <w:szCs w:val="19"/>
+        </w:rPr>
+        <w:t xml:space="preserve">	10</w:t>
+      </w:r>
+    </w:p>
+    <w:p>
+      <w:pPr>
+        <w:tabs>
+          <w:tab w:val="right" w:pos="9026" w:leader="dot"/>
+        </w:tabs>
+        <w:spacing w:before="0" w:after="20"/>
+        <w:ind w:left="360"/>
+      </w:pPr>
+      <w:r>
+        <w:rPr>
+          <w:b w:val="false"/>
+          <w:bCs w:val="false"/>
+          <w:sz w:val="19"/>
+          <w:szCs w:val="19"/>
+        </w:rPr>
+        <w:t xml:space="preserve">5.4 Test programs</w:t>
+      </w:r>
+      <w:r>
+        <w:rPr>
+          <w:b w:val="false"/>
+          <w:bCs w:val="false"/>
+          <w:sz w:val="19"/>
+          <w:szCs w:val="19"/>
+        </w:rPr>
+        <w:t xml:space="preserve">	10</w:t>
+      </w:r>
+    </w:p>
+    <w:p>
+      <w:pPr>
+        <w:tabs>
+          <w:tab w:val="right" w:pos="9026" w:leader="dot"/>
+        </w:tabs>
+        <w:spacing w:before="100" w:after="20"/>
+        <w:ind w:left="0"/>
+      </w:pPr>
+      <w:r>
+        <w:rPr>
+          <w:b/>
+          <w:bCs/>
+          <w:sz w:val="21"/>
+          <w:szCs w:val="21"/>
+        </w:rPr>
+        <w:t xml:space="preserve">6. System Design</w:t>
+      </w:r>
+      <w:r>
+        <w:rPr>
+          <w:b/>
+          <w:bCs/>
+          <w:sz w:val="21"/>
+          <w:szCs w:val="21"/>
+        </w:rPr>
+        <w:t xml:space="preserve">	11</w:t>
+      </w:r>
+    </w:p>
+    <w:p>
+      <w:pPr>
+        <w:tabs>
+          <w:tab w:val="right" w:pos="9026" w:leader="dot"/>
+        </w:tabs>
+        <w:spacing w:before="0" w:after="20"/>
+        <w:ind w:left="360"/>
+      </w:pPr>
+      <w:r>
+        <w:rPr>
+          <w:b w:val="false"/>
+          <w:bCs w:val="false"/>
+          <w:sz w:val="19"/>
+          <w:szCs w:val="19"/>
+        </w:rPr>
+        <w:t xml:space="preserve">6.1 Architecture</w:t>
+      </w:r>
+      <w:r>
+        <w:rPr>
+          <w:b w:val="false"/>
+          <w:bCs w:val="false"/>
+          <w:sz w:val="19"/>
+          <w:szCs w:val="19"/>
+        </w:rPr>
+        <w:t xml:space="preserve">	11</w:t>
+      </w:r>
+    </w:p>
+    <w:p>
+      <w:pPr>
+        <w:tabs>
+          <w:tab w:val="right" w:pos="9026" w:leader="dot"/>
+        </w:tabs>
+        <w:spacing w:before="0" w:after="20"/>
+        <w:ind w:left="360"/>
+      </w:pPr>
+      <w:r>
+        <w:rPr>
+          <w:b w:val="false"/>
+          <w:bCs w:val="false"/>
+          <w:sz w:val="19"/>
+          <w:szCs w:val="19"/>
+        </w:rPr>
+        <w:t xml:space="preserve">6.2 Modules and interfaces</w:t>
+      </w:r>
+      <w:r>
+        <w:rPr>
+          <w:b w:val="false"/>
+          <w:bCs w:val="false"/>
+          <w:sz w:val="19"/>
+          <w:szCs w:val="19"/>
+        </w:rPr>
+        <w:t xml:space="preserve">	11</w:t>
+      </w:r>
+    </w:p>
+    <w:p>
+      <w:pPr>
+        <w:tabs>
+          <w:tab w:val="right" w:pos="9026" w:leader="dot"/>
+        </w:tabs>
+        <w:spacing w:before="0" w:after="20"/>
+        <w:ind w:left="360"/>
+      </w:pPr>
+      <w:r>
+        <w:rPr>
+          <w:b w:val="false"/>
+          <w:bCs w:val="false"/>
+          <w:sz w:val="19"/>
+          <w:szCs w:val="19"/>
+        </w:rPr>
+        <w:t xml:space="preserve">6.3 Core data structures</w:t>
+      </w:r>
+      <w:r>
+        <w:rPr>
+          <w:b w:val="false"/>
+          <w:bCs w:val="false"/>
+          <w:sz w:val="19"/>
+          <w:szCs w:val="19"/>
+        </w:rPr>
+        <w:t xml:space="preserve">	12</w:t>
+      </w:r>
+    </w:p>
+    <w:p>
+      <w:pPr>
+        <w:tabs>
+          <w:tab w:val="right" w:pos="9026" w:leader="dot"/>
+        </w:tabs>
+        <w:spacing w:before="0" w:after="20"/>
+        <w:ind w:left="360"/>
+      </w:pPr>
+      <w:r>
+        <w:rPr>
+          <w:b w:val="false"/>
+          <w:bCs w:val="false"/>
+          <w:sz w:val="19"/>
+          <w:szCs w:val="19"/>
+        </w:rPr>
+        <w:t xml:space="preserve">6.4 Execution paths of GETFIELD</w:t>
+      </w:r>
+      <w:r>
+        <w:rPr>
+          <w:b w:val="false"/>
+          <w:bCs w:val="false"/>
+          <w:sz w:val="19"/>
+          <w:szCs w:val="19"/>
+        </w:rPr>
+        <w:t xml:space="preserve">	12</w:t>
+      </w:r>
+    </w:p>
+    <w:p>
+      <w:pPr>
+        <w:tabs>
+          <w:tab w:val="right" w:pos="9026" w:leader="dot"/>
+        </w:tabs>
+        <w:spacing w:before="0" w:after="20"/>
+        <w:ind w:left="360"/>
+      </w:pPr>
+      <w:r>
+        <w:rPr>
+          <w:b w:val="false"/>
+          <w:bCs w:val="false"/>
+          <w:sz w:val="19"/>
+          <w:szCs w:val="19"/>
+        </w:rPr>
+        <w:t xml:space="preserve">6.5 Key design decisions</w:t>
+      </w:r>
+      <w:r>
+        <w:rPr>
+          <w:b w:val="false"/>
+          <w:bCs w:val="false"/>
+          <w:sz w:val="19"/>
+          <w:szCs w:val="19"/>
+        </w:rPr>
+        <w:t xml:space="preserve">	12</w:t>
+      </w:r>
+    </w:p>
+    <w:p>
+      <w:pPr>
+        <w:tabs>
+          <w:tab w:val="right" w:pos="9026" w:leader="dot"/>
+        </w:tabs>
+        <w:spacing w:before="100" w:after="20"/>
+        <w:ind w:left="0"/>
+      </w:pPr>
+      <w:r>
+        <w:rPr>
+          <w:b/>
+          <w:bCs/>
+          <w:sz w:val="21"/>
+          <w:szCs w:val="21"/>
+        </w:rPr>
+        <w:t xml:space="preserve">7. Algorithms and Methodology</w:t>
+      </w:r>
+      <w:r>
+        <w:rPr>
+          <w:b/>
+          <w:bCs/>
+          <w:sz w:val="21"/>
+          <w:szCs w:val="21"/>
+        </w:rPr>
+        <w:t xml:space="preserve">	14</w:t>
+      </w:r>
+    </w:p>
+    <w:p>
+      <w:pPr>
+        <w:tabs>
+          <w:tab w:val="right" w:pos="9026" w:leader="dot"/>
+        </w:tabs>
+        <w:spacing w:before="0" w:after="20"/>
+        <w:ind w:left="360"/>
+      </w:pPr>
+      <w:r>
+        <w:rPr>
+          <w:b w:val="false"/>
+          <w:bCs w:val="false"/>
+          <w:sz w:val="19"/>
+          <w:szCs w:val="19"/>
+        </w:rPr>
+        <w:t xml:space="preserve">7.1 Bytecode execution and instruction set</w:t>
+      </w:r>
+      <w:r>
+        <w:rPr>
+          <w:b w:val="false"/>
+          <w:bCs w:val="false"/>
+          <w:sz w:val="19"/>
+          <w:szCs w:val="19"/>
+        </w:rPr>
+        <w:t xml:space="preserve">	14</w:t>
+      </w:r>
+    </w:p>
+    <w:p>
+      <w:pPr>
+        <w:tabs>
+          <w:tab w:val="right" w:pos="9026" w:leader="dot"/>
+        </w:tabs>
+        <w:spacing w:before="0" w:after="20"/>
+        <w:ind w:left="360"/>
+      </w:pPr>
+      <w:r>
+        <w:rPr>
+          <w:b w:val="false"/>
+          <w:bCs w:val="false"/>
+          <w:sz w:val="19"/>
+          <w:szCs w:val="19"/>
+        </w:rPr>
+        <w:t xml:space="preserve">7.2 Hot-loop detection</w:t>
+      </w:r>
+      <w:r>
+        <w:rPr>
+          <w:b w:val="false"/>
+          <w:bCs w:val="false"/>
+          <w:sz w:val="19"/>
+          <w:szCs w:val="19"/>
+        </w:rPr>
+        <w:t xml:space="preserve">	14</w:t>
+      </w:r>
+    </w:p>
+    <w:p>
+      <w:pPr>
+        <w:tabs>
+          <w:tab w:val="right" w:pos="9026" w:leader="dot"/>
+        </w:tabs>
+        <w:spacing w:before="0" w:after="20"/>
+        <w:ind w:left="360"/>
+      </w:pPr>
+      <w:r>
+        <w:rPr>
+          <w:b w:val="false"/>
+          <w:bCs w:val="false"/>
+          <w:sz w:val="19"/>
+          <w:szCs w:val="19"/>
+        </w:rPr>
+        <w:t xml:space="preserve">7.3 Inline-cache lookup and state transitions</w:t>
+      </w:r>
+      <w:r>
+        <w:rPr>
+          <w:b w:val="false"/>
+          <w:bCs w:val="false"/>
+          <w:sz w:val="19"/>
+          <w:szCs w:val="19"/>
+        </w:rPr>
+        <w:t xml:space="preserve">	14</w:t>
+      </w:r>
+    </w:p>
+    <w:p>
+      <w:pPr>
+        <w:tabs>
+          <w:tab w:val="right" w:pos="9026" w:leader="dot"/>
+        </w:tabs>
+        <w:spacing w:before="0" w:after="20"/>
+        <w:ind w:left="360"/>
+      </w:pPr>
+      <w:r>
+        <w:rPr>
+          <w:b w:val="false"/>
+          <w:bCs w:val="false"/>
+          <w:sz w:val="19"/>
+          <w:szCs w:val="19"/>
+        </w:rPr>
+        <w:t xml:space="preserve">7.4 Lazy invalidation by shape versioning</w:t>
+      </w:r>
+      <w:r>
+        <w:rPr>
+          <w:b w:val="false"/>
+          <w:bCs w:val="false"/>
+          <w:sz w:val="19"/>
+          <w:szCs w:val="19"/>
+        </w:rPr>
+        <w:t xml:space="preserve">	15</w:t>
+      </w:r>
+    </w:p>
+    <w:p>
+      <w:pPr>
+        <w:tabs>
+          <w:tab w:val="right" w:pos="9026" w:leader="dot"/>
+        </w:tabs>
+        <w:spacing w:before="0" w:after="20"/>
+        <w:ind w:left="360"/>
+      </w:pPr>
+      <w:r>
+        <w:rPr>
+          <w:b w:val="false"/>
+          <w:bCs w:val="false"/>
+          <w:sz w:val="19"/>
+          <w:szCs w:val="19"/>
+        </w:rPr>
+        <w:t xml:space="preserve">7.5 Tier-2 guarded load and deoptimisation</w:t>
+      </w:r>
+      <w:r>
+        <w:rPr>
+          <w:b w:val="false"/>
+          <w:bCs w:val="false"/>
+          <w:sz w:val="19"/>
+          <w:szCs w:val="19"/>
+        </w:rPr>
+        <w:t xml:space="preserve">	15</w:t>
+      </w:r>
+    </w:p>
+    <w:p>
+      <w:pPr>
+        <w:tabs>
+          <w:tab w:val="right" w:pos="9026" w:leader="dot"/>
+        </w:tabs>
+        <w:spacing w:before="0" w:after="20"/>
+        <w:ind w:left="360"/>
+      </w:pPr>
+      <w:r>
+        <w:rPr>
+          <w:b w:val="false"/>
+          <w:bCs w:val="false"/>
+          <w:sz w:val="19"/>
+          <w:szCs w:val="19"/>
+        </w:rPr>
+        <w:t xml:space="preserve">7.6 Front end: lexing, parsing and code generation</w:t>
+      </w:r>
+      <w:r>
+        <w:rPr>
+          <w:b w:val="false"/>
+          <w:bCs w:val="false"/>
+          <w:sz w:val="19"/>
+          <w:szCs w:val="19"/>
+        </w:rPr>
+        <w:t xml:space="preserve">	15</w:t>
+      </w:r>
+    </w:p>
+    <w:p>
+      <w:pPr>
+        <w:tabs>
+          <w:tab w:val="right" w:pos="9026" w:leader="dot"/>
+        </w:tabs>
+        <w:spacing w:before="0" w:after="20"/>
+        <w:ind w:left="360"/>
+      </w:pPr>
+      <w:r>
+        <w:rPr>
+          <w:b w:val="false"/>
+          <w:bCs w:val="false"/>
+          <w:sz w:val="19"/>
+          <w:szCs w:val="19"/>
+        </w:rPr>
+        <w:t xml:space="preserve">7.7 Complexity and trade-offs</w:t>
+      </w:r>
+      <w:r>
+        <w:rPr>
+          <w:b w:val="false"/>
+          <w:bCs w:val="false"/>
+          <w:sz w:val="19"/>
+          <w:szCs w:val="19"/>
+        </w:rPr>
+        <w:t xml:space="preserve">	16</w:t>
+      </w:r>
+    </w:p>
+    <w:p>
+      <w:pPr>
+        <w:tabs>
+          <w:tab w:val="right" w:pos="9026" w:leader="dot"/>
+        </w:tabs>
+        <w:spacing w:before="100" w:after="20"/>
+        <w:ind w:left="0"/>
+      </w:pPr>
+      <w:r>
+        <w:rPr>
+          <w:b/>
+          <w:bCs/>
+          <w:sz w:val="21"/>
+          <w:szCs w:val="21"/>
+        </w:rPr>
+        <w:t xml:space="preserve">8. Implementation Details</w:t>
+      </w:r>
+      <w:r>
+        <w:rPr>
+          <w:b/>
+          <w:bCs/>
+          <w:sz w:val="21"/>
+          <w:szCs w:val="21"/>
+        </w:rPr>
+        <w:t xml:space="preserve">	17</w:t>
+      </w:r>
+    </w:p>
+    <w:p>
+      <w:pPr>
+        <w:tabs>
+          <w:tab w:val="right" w:pos="9026" w:leader="dot"/>
+        </w:tabs>
+        <w:spacing w:before="0" w:after="20"/>
+        <w:ind w:left="360"/>
+      </w:pPr>
+      <w:r>
+        <w:rPr>
+          <w:b w:val="false"/>
+          <w:bCs w:val="false"/>
+          <w:sz w:val="19"/>
+          <w:szCs w:val="19"/>
+        </w:rPr>
+        <w:t xml:space="preserve">8.1 Code organisation</w:t>
+      </w:r>
+      <w:r>
+        <w:rPr>
+          <w:b w:val="false"/>
+          <w:bCs w:val="false"/>
+          <w:sz w:val="19"/>
+          <w:szCs w:val="19"/>
+        </w:rPr>
+        <w:t xml:space="preserve">	17</w:t>
+      </w:r>
+    </w:p>
+    <w:p>
+      <w:pPr>
+        <w:tabs>
+          <w:tab w:val="right" w:pos="9026" w:leader="dot"/>
+        </w:tabs>
+        <w:spacing w:before="0" w:after="20"/>
+        <w:ind w:left="360"/>
+      </w:pPr>
+      <w:r>
+        <w:rPr>
+          <w:b w:val="false"/>
+          <w:bCs w:val="false"/>
+          <w:sz w:val="19"/>
+          <w:szCs w:val="19"/>
+        </w:rPr>
+        <w:t xml:space="preserve">8.2 Module walkthrough</w:t>
+      </w:r>
+      <w:r>
+        <w:rPr>
+          <w:b w:val="false"/>
+          <w:bCs w:val="false"/>
+          <w:sz w:val="19"/>
+          <w:szCs w:val="19"/>
+        </w:rPr>
+        <w:t xml:space="preserve">	17</w:t>
+      </w:r>
+    </w:p>
+    <w:p>
+      <w:pPr>
+        <w:tabs>
+          <w:tab w:val="right" w:pos="9026" w:leader="dot"/>
+        </w:tabs>
+        <w:spacing w:before="0" w:after="20"/>
+        <w:ind w:left="360"/>
+      </w:pPr>
+      <w:r>
+        <w:rPr>
+          <w:b w:val="false"/>
+          <w:bCs w:val="false"/>
+          <w:sz w:val="19"/>
+          <w:szCs w:val="19"/>
+        </w:rPr>
+        <w:t xml:space="preserve">8.3 Example: source to bytecode</w:t>
+      </w:r>
+      <w:r>
+        <w:rPr>
+          <w:b w:val="false"/>
+          <w:bCs w:val="false"/>
+          <w:sz w:val="19"/>
+          <w:szCs w:val="19"/>
+        </w:rPr>
+        <w:t xml:space="preserve">	18</w:t>
+      </w:r>
+    </w:p>
+    <w:p>
+      <w:pPr>
+        <w:tabs>
+          <w:tab w:val="right" w:pos="9026" w:leader="dot"/>
+        </w:tabs>
+        <w:spacing w:before="0" w:after="20"/>
+        <w:ind w:left="360"/>
+      </w:pPr>
+      <w:r>
+        <w:rPr>
+          <w:b w:val="false"/>
+          <w:bCs w:val="false"/>
+          <w:sz w:val="19"/>
+          <w:szCs w:val="19"/>
+        </w:rPr>
+        <w:t xml:space="preserve">8.4 Build and integration</w:t>
+      </w:r>
+      <w:r>
+        <w:rPr>
+          <w:b w:val="false"/>
+          <w:bCs w:val="false"/>
+          <w:sz w:val="19"/>
+          <w:szCs w:val="19"/>
+        </w:rPr>
+        <w:t xml:space="preserve">	18</w:t>
+      </w:r>
+    </w:p>
+    <w:p>
+      <w:pPr>
+        <w:tabs>
+          <w:tab w:val="right" w:pos="9026" w:leader="dot"/>
+        </w:tabs>
+        <w:spacing w:before="100" w:after="20"/>
+        <w:ind w:left="0"/>
+      </w:pPr>
+      <w:r>
+        <w:rPr>
+          <w:b/>
+          <w:bCs/>
+          <w:sz w:val="21"/>
+          <w:szCs w:val="21"/>
+        </w:rPr>
+        <w:t xml:space="preserve">9. Testing Strategy and Test Cases</w:t>
+      </w:r>
+      <w:r>
+        <w:rPr>
+          <w:b/>
+          <w:bCs/>
+          <w:sz w:val="21"/>
+          <w:szCs w:val="21"/>
+        </w:rPr>
+        <w:t xml:space="preserve">	19</w:t>
+      </w:r>
+    </w:p>
+    <w:p>
+      <w:pPr>
+        <w:tabs>
+          <w:tab w:val="right" w:pos="9026" w:leader="dot"/>
+        </w:tabs>
+        <w:spacing w:before="0" w:after="20"/>
+        <w:ind w:left="360"/>
+      </w:pPr>
+      <w:r>
+        <w:rPr>
+          <w:b w:val="false"/>
+          <w:bCs w:val="false"/>
+          <w:sz w:val="19"/>
+          <w:szCs w:val="19"/>
+        </w:rPr>
+        <w:t xml:space="preserve">9.1 Strategy</w:t>
+      </w:r>
+      <w:r>
+        <w:rPr>
+          <w:b w:val="false"/>
+          <w:bCs w:val="false"/>
+          <w:sz w:val="19"/>
+          <w:szCs w:val="19"/>
+        </w:rPr>
+        <w:t xml:space="preserve">	19</w:t>
+      </w:r>
+    </w:p>
+    <w:p>
+      <w:pPr>
+        <w:tabs>
+          <w:tab w:val="right" w:pos="9026" w:leader="dot"/>
+        </w:tabs>
+        <w:spacing w:before="0" w:after="20"/>
+        <w:ind w:left="360"/>
+      </w:pPr>
+      <w:r>
+        <w:rPr>
+          <w:b w:val="false"/>
+          <w:bCs w:val="false"/>
+          <w:sz w:val="19"/>
+          <w:szCs w:val="19"/>
+        </w:rPr>
+        <w:t xml:space="preserve">9.2 Unit tests</w:t>
+      </w:r>
+      <w:r>
+        <w:rPr>
+          <w:b w:val="false"/>
+          <w:bCs w:val="false"/>
+          <w:sz w:val="19"/>
+          <w:szCs w:val="19"/>
+        </w:rPr>
+        <w:t xml:space="preserve">	19</w:t>
+      </w:r>
+    </w:p>
+    <w:p>
+      <w:pPr>
+        <w:tabs>
+          <w:tab w:val="right" w:pos="9026" w:leader="dot"/>
+        </w:tabs>
+        <w:spacing w:before="0" w:after="20"/>
+        <w:ind w:left="360"/>
+      </w:pPr>
+      <w:r>
+        <w:rPr>
+          <w:b w:val="false"/>
+          <w:bCs w:val="false"/>
+          <w:sz w:val="19"/>
+          <w:szCs w:val="19"/>
+        </w:rPr>
+        <w:t xml:space="preserve">9.3 End-to-end tests against Node.js</w:t>
+      </w:r>
+      <w:r>
+        <w:rPr>
+          <w:b w:val="false"/>
+          <w:bCs w:val="false"/>
+          <w:sz w:val="19"/>
+          <w:szCs w:val="19"/>
+        </w:rPr>
+        <w:t xml:space="preserve">	20</w:t>
+      </w:r>
+    </w:p>
+    <w:p>
+      <w:pPr>
+        <w:tabs>
+          <w:tab w:val="right" w:pos="9026" w:leader="dot"/>
+        </w:tabs>
+        <w:spacing w:before="0" w:after="20"/>
+        <w:ind w:left="360"/>
+      </w:pPr>
+      <w:r>
+        <w:rPr>
+          <w:b w:val="false"/>
+          <w:bCs w:val="false"/>
+          <w:sz w:val="19"/>
+          <w:szCs w:val="19"/>
+        </w:rPr>
+        <w:t xml:space="preserve">9.4 Invalid-input and failure tests</w:t>
+      </w:r>
+      <w:r>
+        <w:rPr>
+          <w:b w:val="false"/>
+          <w:bCs w:val="false"/>
+          <w:sz w:val="19"/>
+          <w:szCs w:val="19"/>
+        </w:rPr>
+        <w:t xml:space="preserve">	20</w:t>
+      </w:r>
+    </w:p>
+    <w:p>
+      <w:pPr>
+        <w:tabs>
+          <w:tab w:val="right" w:pos="9026" w:leader="dot"/>
+        </w:tabs>
+        <w:spacing w:before="0" w:after="20"/>
+        <w:ind w:left="360"/>
+      </w:pPr>
+      <w:r>
+        <w:rPr>
+          <w:b w:val="false"/>
+          <w:bCs w:val="false"/>
+          <w:sz w:val="19"/>
+          <w:szCs w:val="19"/>
+        </w:rPr>
+        <w:t xml:space="preserve">9.5 Summary</w:t>
+      </w:r>
+      <w:r>
+        <w:rPr>
+          <w:b w:val="false"/>
+          <w:bCs w:val="false"/>
+          <w:sz w:val="19"/>
+          <w:szCs w:val="19"/>
+        </w:rPr>
+        <w:t xml:space="preserve">	21</w:t>
+      </w:r>
+    </w:p>
+    <w:p>
+      <w:pPr>
+        <w:tabs>
+          <w:tab w:val="right" w:pos="9026" w:leader="dot"/>
+        </w:tabs>
+        <w:spacing w:before="100" w:after="20"/>
+        <w:ind w:left="0"/>
+      </w:pPr>
+      <w:r>
+        <w:rPr>
+          <w:b/>
+          <w:bCs/>
+          <w:sz w:val="21"/>
+          <w:szCs w:val="21"/>
+        </w:rPr>
+        <w:t xml:space="preserve">10. Results and Evaluation</w:t>
+      </w:r>
+      <w:r>
+        <w:rPr>
+          <w:b/>
+          <w:bCs/>
+          <w:sz w:val="21"/>
+          <w:szCs w:val="21"/>
+        </w:rPr>
+        <w:t xml:space="preserve">	22</w:t>
+      </w:r>
+    </w:p>
+    <w:p>
+      <w:pPr>
+        <w:tabs>
+          <w:tab w:val="right" w:pos="9026" w:leader="dot"/>
+        </w:tabs>
+        <w:spacing w:before="0" w:after="20"/>
+        <w:ind w:left="360"/>
+      </w:pPr>
+      <w:r>
+        <w:rPr>
+          <w:b w:val="false"/>
+          <w:bCs w:val="false"/>
+          <w:sz w:val="19"/>
+          <w:szCs w:val="19"/>
+        </w:rPr>
+        <w:t xml:space="preserve">10.1 Benchmark setup</w:t>
+      </w:r>
+      <w:r>
+        <w:rPr>
+          <w:b w:val="false"/>
+          <w:bCs w:val="false"/>
+          <w:sz w:val="19"/>
+          <w:szCs w:val="19"/>
+        </w:rPr>
+        <w:t xml:space="preserve">	22</w:t>
+      </w:r>
+    </w:p>
+    <w:p>
+      <w:pPr>
+        <w:tabs>
+          <w:tab w:val="right" w:pos="9026" w:leader="dot"/>
+        </w:tabs>
+        <w:spacing w:before="0" w:after="20"/>
+        <w:ind w:left="360"/>
+      </w:pPr>
+      <w:r>
+        <w:rPr>
+          <w:b w:val="false"/>
+          <w:bCs w:val="false"/>
+          <w:sz w:val="19"/>
+          <w:szCs w:val="19"/>
+        </w:rPr>
+        <w:t xml:space="preserve">10.2 Synthetic workloads (200-field objects)</w:t>
+      </w:r>
+      <w:r>
+        <w:rPr>
+          <w:b w:val="false"/>
+          <w:bCs w:val="false"/>
+          <w:sz w:val="19"/>
+          <w:szCs w:val="19"/>
+        </w:rPr>
+        <w:t xml:space="preserve">	22</w:t>
+      </w:r>
+    </w:p>
+    <w:p>
+      <w:pPr>
+        <w:tabs>
+          <w:tab w:val="right" w:pos="9026" w:leader="dot"/>
+        </w:tabs>
+        <w:spacing w:before="0" w:after="20"/>
+        <w:ind w:left="360"/>
+      </w:pPr>
+      <w:r>
+        <w:rPr>
+          <w:b w:val="false"/>
+          <w:bCs w:val="false"/>
+          <w:sz w:val="19"/>
+          <w:szCs w:val="19"/>
+        </w:rPr>
+        <w:t xml:space="preserve">10.3 Megamorphic cache tuning</w:t>
+      </w:r>
+      <w:r>
+        <w:rPr>
+          <w:b w:val="false"/>
+          <w:bCs w:val="false"/>
+          <w:sz w:val="19"/>
+          <w:szCs w:val="19"/>
+        </w:rPr>
+        <w:t xml:space="preserve">	22</w:t>
+      </w:r>
+    </w:p>
+    <w:p>
+      <w:pPr>
+        <w:tabs>
+          <w:tab w:val="right" w:pos="9026" w:leader="dot"/>
+        </w:tabs>
+        <w:spacing w:before="0" w:after="20"/>
+        <w:ind w:left="360"/>
+      </w:pPr>
+      <w:r>
+        <w:rPr>
+          <w:b w:val="false"/>
+          <w:bCs w:val="false"/>
+          <w:sz w:val="19"/>
+          <w:szCs w:val="19"/>
+        </w:rPr>
+        <w:t xml:space="preserve">10.4 JavaScript programs</w:t>
+      </w:r>
+      <w:r>
+        <w:rPr>
+          <w:b w:val="false"/>
+          <w:bCs w:val="false"/>
+          <w:sz w:val="19"/>
+          <w:szCs w:val="19"/>
+        </w:rPr>
+        <w:t xml:space="preserve">	23</w:t>
+      </w:r>
+    </w:p>
+    <w:p>
+      <w:pPr>
+        <w:tabs>
+          <w:tab w:val="right" w:pos="9026" w:leader="dot"/>
+        </w:tabs>
+        <w:spacing w:before="0" w:after="20"/>
+        <w:ind w:left="360"/>
+      </w:pPr>
+      <w:r>
+        <w:rPr>
+          <w:b w:val="false"/>
+          <w:bCs w:val="false"/>
+          <w:sz w:val="19"/>
+          <w:szCs w:val="19"/>
+        </w:rPr>
+        <w:t xml:space="preserve">10.5 Hot-loop threshold sweep</w:t>
+      </w:r>
+      <w:r>
+        <w:rPr>
+          <w:b w:val="false"/>
+          <w:bCs w:val="false"/>
+          <w:sz w:val="19"/>
+          <w:szCs w:val="19"/>
+        </w:rPr>
+        <w:t xml:space="preserve">	24</w:t>
+      </w:r>
+    </w:p>
+    <w:p>
+      <w:pPr>
+        <w:tabs>
+          <w:tab w:val="right" w:pos="9026" w:leader="dot"/>
+        </w:tabs>
+        <w:spacing w:before="0" w:after="20"/>
+        <w:ind w:left="360"/>
+      </w:pPr>
+      <w:r>
+        <w:rPr>
+          <w:b w:val="false"/>
+          <w:bCs w:val="false"/>
+          <w:sz w:val="19"/>
+          <w:szCs w:val="19"/>
+        </w:rPr>
+        <w:t xml:space="preserve">10.6 Comparison with V8</w:t>
+      </w:r>
+      <w:r>
+        <w:rPr>
+          <w:b w:val="false"/>
+          <w:bCs w:val="false"/>
+          <w:sz w:val="19"/>
+          <w:szCs w:val="19"/>
+        </w:rPr>
+        <w:t xml:space="preserve">	25</w:t>
+      </w:r>
+    </w:p>
+    <w:p>
+      <w:pPr>
+        <w:tabs>
+          <w:tab w:val="right" w:pos="9026" w:leader="dot"/>
+        </w:tabs>
+        <w:spacing w:before="0" w:after="20"/>
+        <w:ind w:left="360"/>
+      </w:pPr>
+      <w:r>
+        <w:rPr>
+          <w:b w:val="false"/>
+          <w:bCs w:val="false"/>
+          <w:sz w:val="19"/>
+          <w:szCs w:val="19"/>
+        </w:rPr>
+        <w:t xml:space="preserve">10.7 Overall assessment</w:t>
+      </w:r>
+      <w:r>
+        <w:rPr>
+          <w:b w:val="false"/>
+          <w:bCs w:val="false"/>
+          <w:sz w:val="19"/>
+          <w:szCs w:val="19"/>
+        </w:rPr>
+        <w:t xml:space="preserve">	25</w:t>
+      </w:r>
+    </w:p>
+    <w:p>
+      <w:pPr>
+        <w:tabs>
+          <w:tab w:val="right" w:pos="9026" w:leader="dot"/>
+        </w:tabs>
+        <w:spacing w:before="100" w:after="20"/>
+        <w:ind w:left="0"/>
+      </w:pPr>
+      <w:r>
+        <w:rPr>
+          <w:b/>
+          <w:bCs/>
+          <w:sz w:val="21"/>
+          <w:szCs w:val="21"/>
+        </w:rPr>
+        <w:t xml:space="preserve">11. Error Handling, Limitations and Known Issues</w:t>
+      </w:r>
+      <w:r>
+        <w:rPr>
+          <w:b/>
+          <w:bCs/>
+          <w:sz w:val="21"/>
+          <w:szCs w:val="21"/>
+        </w:rPr>
+        <w:t xml:space="preserve">	26</w:t>
+      </w:r>
+    </w:p>
+    <w:p>
+      <w:pPr>
+        <w:tabs>
+          <w:tab w:val="right" w:pos="9026" w:leader="dot"/>
+        </w:tabs>
+        <w:spacing w:before="0" w:after="20"/>
+        <w:ind w:left="360"/>
+      </w:pPr>
+      <w:r>
+        <w:rPr>
+          <w:b w:val="false"/>
+          <w:bCs w:val="false"/>
+          <w:sz w:val="19"/>
+          <w:szCs w:val="19"/>
+        </w:rPr>
+        <w:t xml:space="preserve">11.1 Error handling</w:t>
+      </w:r>
+      <w:r>
+        <w:rPr>
+          <w:b w:val="false"/>
+          <w:bCs w:val="false"/>
+          <w:sz w:val="19"/>
+          <w:szCs w:val="19"/>
+        </w:rPr>
+        <w:t xml:space="preserve">	26</w:t>
+      </w:r>
+    </w:p>
+    <w:p>
+      <w:pPr>
+        <w:tabs>
+          <w:tab w:val="right" w:pos="9026" w:leader="dot"/>
+        </w:tabs>
+        <w:spacing w:before="0" w:after="20"/>
+        <w:ind w:left="360"/>
+      </w:pPr>
+      <w:r>
+        <w:rPr>
+          <w:b w:val="false"/>
+          <w:bCs w:val="false"/>
+          <w:sz w:val="19"/>
+          <w:szCs w:val="19"/>
+        </w:rPr>
+        <w:t xml:space="preserve">11.2 Unsupported features</w:t>
+      </w:r>
+      <w:r>
+        <w:rPr>
+          <w:b w:val="false"/>
+          <w:bCs w:val="false"/>
+          <w:sz w:val="19"/>
+          <w:szCs w:val="19"/>
+        </w:rPr>
+        <w:t xml:space="preserve">	26</w:t>
+      </w:r>
+    </w:p>
+    <w:p>
+      <w:pPr>
+        <w:tabs>
+          <w:tab w:val="right" w:pos="9026" w:leader="dot"/>
+        </w:tabs>
+        <w:spacing w:before="0" w:after="20"/>
+        <w:ind w:left="360"/>
+      </w:pPr>
+      <w:r>
+        <w:rPr>
+          <w:b w:val="false"/>
+          <w:bCs w:val="false"/>
+          <w:sz w:val="19"/>
+          <w:szCs w:val="19"/>
+        </w:rPr>
+        <w:t xml:space="preserve">11.3 Known behavioural differences from JavaScript</w:t>
+      </w:r>
+      <w:r>
+        <w:rPr>
+          <w:b w:val="false"/>
+          <w:bCs w:val="false"/>
+          <w:sz w:val="19"/>
+          <w:szCs w:val="19"/>
+        </w:rPr>
+        <w:t xml:space="preserve">	26</w:t>
+      </w:r>
+    </w:p>
+    <w:p>
+      <w:pPr>
+        <w:tabs>
+          <w:tab w:val="right" w:pos="9026" w:leader="dot"/>
+        </w:tabs>
+        <w:spacing w:before="0" w:after="20"/>
+        <w:ind w:left="360"/>
+      </w:pPr>
+      <w:r>
+        <w:rPr>
+          <w:b w:val="false"/>
+          <w:bCs w:val="false"/>
+          <w:sz w:val="19"/>
+          <w:szCs w:val="19"/>
+        </w:rPr>
+        <w:t xml:space="preserve">11.4 Technical constraints</w:t>
+      </w:r>
+      <w:r>
+        <w:rPr>
+          <w:b w:val="false"/>
+          <w:bCs w:val="false"/>
+          <w:sz w:val="19"/>
+          <w:szCs w:val="19"/>
+        </w:rPr>
+        <w:t xml:space="preserve">	26</w:t>
+      </w:r>
+    </w:p>
+    <w:p>
+      <w:pPr>
+        <w:tabs>
+          <w:tab w:val="right" w:pos="9026" w:leader="dot"/>
+        </w:tabs>
+        <w:spacing w:before="100" w:after="20"/>
+        <w:ind w:left="0"/>
+      </w:pPr>
+      <w:r>
+        <w:rPr>
+          <w:b/>
+          <w:bCs/>
+          <w:sz w:val="21"/>
+          <w:szCs w:val="21"/>
+        </w:rPr>
+        <w:t xml:space="preserve">12. Member-Wise Contribution</w:t>
+      </w:r>
+      <w:r>
+        <w:rPr>
+          <w:b/>
+          <w:bCs/>
+          <w:sz w:val="21"/>
+          <w:szCs w:val="21"/>
+        </w:rPr>
+        <w:t xml:space="preserve">	28</w:t>
+      </w:r>
+    </w:p>
+    <w:p>
+      <w:pPr>
+        <w:tabs>
+          <w:tab w:val="right" w:pos="9026" w:leader="dot"/>
+        </w:tabs>
+        <w:spacing w:before="100" w:after="20"/>
+        <w:ind w:left="0"/>
+      </w:pPr>
+      <w:r>
+        <w:rPr>
+          <w:b/>
+          <w:bCs/>
+          <w:sz w:val="21"/>
+          <w:szCs w:val="21"/>
+        </w:rPr>
+        <w:t xml:space="preserve">13. Conclusion and Future Work</w:t>
+      </w:r>
+      <w:r>
+        <w:rPr>
+          <w:b/>
+          <w:bCs/>
+          <w:sz w:val="21"/>
+          <w:szCs w:val="21"/>
+        </w:rPr>
+        <w:t xml:space="preserve">	29</w:t>
+      </w:r>
+    </w:p>
+    <w:p>
+      <w:pPr>
+        <w:tabs>
+          <w:tab w:val="right" w:pos="9026" w:leader="dot"/>
+        </w:tabs>
+        <w:spacing w:before="0" w:after="20"/>
+        <w:ind w:left="360"/>
+      </w:pPr>
+      <w:r>
+        <w:rPr>
+          <w:b w:val="false"/>
+          <w:bCs w:val="false"/>
+          <w:sz w:val="19"/>
+          <w:szCs w:val="19"/>
+        </w:rPr>
+        <w:t xml:space="preserve">13.1 Objectives achieved</w:t>
+      </w:r>
+      <w:r>
+        <w:rPr>
+          <w:b w:val="false"/>
+          <w:bCs w:val="false"/>
+          <w:sz w:val="19"/>
+          <w:szCs w:val="19"/>
+        </w:rPr>
+        <w:t xml:space="preserve">	29</w:t>
+      </w:r>
+    </w:p>
+    <w:p>
+      <w:pPr>
+        <w:tabs>
+          <w:tab w:val="right" w:pos="9026" w:leader="dot"/>
+        </w:tabs>
+        <w:spacing w:before="0" w:after="20"/>
+        <w:ind w:left="360"/>
+      </w:pPr>
+      <w:r>
+        <w:rPr>
+          <w:b w:val="false"/>
+          <w:bCs w:val="false"/>
+          <w:sz w:val="19"/>
+          <w:szCs w:val="19"/>
+        </w:rPr>
+        <w:t xml:space="preserve">13.2 Key learning</w:t>
+      </w:r>
+      <w:r>
+        <w:rPr>
+          <w:b w:val="false"/>
+          <w:bCs w:val="false"/>
+          <w:sz w:val="19"/>
+          <w:szCs w:val="19"/>
+        </w:rPr>
+        <w:t xml:space="preserve">	29</w:t>
+      </w:r>
+    </w:p>
+    <w:p>
+      <w:pPr>
+        <w:tabs>
+          <w:tab w:val="right" w:pos="9026" w:leader="dot"/>
+        </w:tabs>
+        <w:spacing w:before="0" w:after="20"/>
+        <w:ind w:left="360"/>
+      </w:pPr>
+      <w:r>
+        <w:rPr>
+          <w:b w:val="false"/>
+          <w:bCs w:val="false"/>
+          <w:sz w:val="19"/>
+          <w:szCs w:val="19"/>
+        </w:rPr>
+        <w:t xml:space="preserve">13.3 Future work</w:t>
+      </w:r>
+      <w:r>
+        <w:rPr>
+          <w:b w:val="false"/>
+          <w:bCs w:val="false"/>
+          <w:sz w:val="19"/>
+          <w:szCs w:val="19"/>
+        </w:rPr>
+        <w:t xml:space="preserve">	29</w:t>
+      </w:r>
+    </w:p>
+    <w:p>
+      <w:pPr>
+        <w:tabs>
+          <w:tab w:val="right" w:pos="9026" w:leader="dot"/>
+        </w:tabs>
+        <w:spacing w:before="0" w:after="20"/>
+        <w:ind w:left="360"/>
+      </w:pPr>
+      <w:r>
+        <w:rPr>
+          <w:b w:val="false"/>
+          <w:bCs w:val="false"/>
+          <w:sz w:val="19"/>
+          <w:szCs w:val="19"/>
+        </w:rPr>
+        <w:t xml:space="preserve">13.4 Publication and further-development potential</w:t>
+      </w:r>
+      <w:r>
+        <w:rPr>
+          <w:b w:val="false"/>
+          <w:bCs w:val="false"/>
+          <w:sz w:val="19"/>
+          <w:szCs w:val="19"/>
+        </w:rPr>
+        <w:t xml:space="preserve">	29</w:t>
+      </w:r>
+    </w:p>
+    <w:p>
+      <w:pPr>
+        <w:tabs>
+          <w:tab w:val="right" w:pos="9026" w:leader="dot"/>
+        </w:tabs>
+        <w:spacing w:before="100" w:after="20"/>
+        <w:ind w:left="0"/>
+      </w:pPr>
+      <w:r>
+        <w:rPr>
+          <w:b/>
+          <w:bCs/>
+          <w:sz w:val="21"/>
+          <w:szCs w:val="21"/>
+        </w:rPr>
+        <w:t xml:space="preserve">14. References</w:t>
+      </w:r>
+      <w:r>
+        <w:rPr>
+          <w:b/>
+          <w:bCs/>
+          <w:sz w:val="21"/>
+          <w:szCs w:val="21"/>
+        </w:rPr>
+        <w:t xml:space="preserve">	30</w:t>
+      </w:r>
+    </w:p>
+    <w:p>
+      <w:pPr>
+        <w:tabs>
+          <w:tab w:val="right" w:pos="9026" w:leader="dot"/>
+        </w:tabs>
+        <w:spacing w:before="100" w:after="20"/>
+        <w:ind w:left="0"/>
+      </w:pPr>
+      <w:r>
+        <w:rPr>
+          <w:b/>
+          <w:bCs/>
+          <w:sz w:val="21"/>
+          <w:szCs w:val="21"/>
+        </w:rPr>
+        <w:t xml:space="preserve">Appendix A: Installation and User Manual</w:t>
+      </w:r>
+      <w:r>
+        <w:rPr>
+          <w:b/>
+          <w:bCs/>
+          <w:sz w:val="21"/>
+          <w:szCs w:val="21"/>
+        </w:rPr>
+        <w:t xml:space="preserve">	31</w:t>
+      </w:r>
+    </w:p>
+    <w:p>
+      <w:pPr>
+        <w:tabs>
+          <w:tab w:val="right" w:pos="9026" w:leader="dot"/>
+        </w:tabs>
+        <w:spacing w:before="0" w:after="20"/>
+        <w:ind w:left="360"/>
+      </w:pPr>
+      <w:r>
+        <w:rPr>
+          <w:b w:val="false"/>
+          <w:bCs w:val="false"/>
+          <w:sz w:val="19"/>
+          <w:szCs w:val="19"/>
+        </w:rPr>
+        <w:t xml:space="preserve">A.1 Requirements</w:t>
+      </w:r>
+      <w:r>
+        <w:rPr>
+          <w:b w:val="false"/>
+          <w:bCs w:val="false"/>
+          <w:sz w:val="19"/>
+          <w:szCs w:val="19"/>
+        </w:rPr>
+        <w:t xml:space="preserve">	31</w:t>
+      </w:r>
+    </w:p>
+    <w:p>
+      <w:pPr>
+        <w:tabs>
+          <w:tab w:val="right" w:pos="9026" w:leader="dot"/>
+        </w:tabs>
+        <w:spacing w:before="0" w:after="20"/>
+        <w:ind w:left="360"/>
+      </w:pPr>
+      <w:r>
+        <w:rPr>
+          <w:b w:val="false"/>
+          <w:bCs w:val="false"/>
+          <w:sz w:val="19"/>
+          <w:szCs w:val="19"/>
+        </w:rPr>
+        <w:t xml:space="preserve">A.2 Getting the code</w:t>
+      </w:r>
+      <w:r>
+        <w:rPr>
+          <w:b w:val="false"/>
+          <w:bCs w:val="false"/>
+          <w:sz w:val="19"/>
+          <w:szCs w:val="19"/>
+        </w:rPr>
+        <w:t xml:space="preserve">	31</w:t>
+      </w:r>
+    </w:p>
+    <w:p>
+      <w:pPr>
+        <w:tabs>
+          <w:tab w:val="right" w:pos="9026" w:leader="dot"/>
+        </w:tabs>
+        <w:spacing w:before="0" w:after="20"/>
+        <w:ind w:left="360"/>
+      </w:pPr>
+      <w:r>
+        <w:rPr>
+          <w:b w:val="false"/>
+          <w:bCs w:val="false"/>
+          <w:sz w:val="19"/>
+          <w:szCs w:val="19"/>
+        </w:rPr>
+        <w:t xml:space="preserve">A.3 Commands</w:t>
+      </w:r>
+      <w:r>
+        <w:rPr>
+          <w:b w:val="false"/>
+          <w:bCs w:val="false"/>
+          <w:sz w:val="19"/>
+          <w:szCs w:val="19"/>
+        </w:rPr>
+        <w:t xml:space="preserve">	31</w:t>
+      </w:r>
+    </w:p>
+    <w:p>
+      <w:pPr>
+        <w:tabs>
+          <w:tab w:val="right" w:pos="9026" w:leader="dot"/>
+        </w:tabs>
+        <w:spacing w:before="0" w:after="20"/>
+        <w:ind w:left="360"/>
+      </w:pPr>
+      <w:r>
+        <w:rPr>
+          <w:b w:val="false"/>
+          <w:bCs w:val="false"/>
+          <w:sz w:val="19"/>
+          <w:szCs w:val="19"/>
+        </w:rPr>
+        <w:t xml:space="preserve">A.4 Writing your own program</w:t>
+      </w:r>
+      <w:r>
+        <w:rPr>
+          <w:b w:val="false"/>
+          <w:bCs w:val="false"/>
+          <w:sz w:val="19"/>
+          <w:szCs w:val="19"/>
+        </w:rPr>
+        <w:t xml:space="preserve">	31</w:t>
+      </w:r>
+    </w:p>
+    <w:p>
+      <w:pPr>
+        <w:tabs>
+          <w:tab w:val="right" w:pos="9026" w:leader="dot"/>
+        </w:tabs>
+        <w:spacing w:before="100" w:after="20"/>
+        <w:ind w:left="0"/>
+      </w:pPr>
+      <w:r>
+        <w:rPr>
+          <w:b/>
+          <w:bCs/>
+          <w:sz w:val="21"/>
+          <w:szCs w:val="21"/>
+        </w:rPr>
+        <w:t xml:space="preserve">Appendix B: Sample Runs</w:t>
+      </w:r>
+      <w:r>
+        <w:rPr>
+          <w:b/>
+          <w:bCs/>
+          <w:sz w:val="21"/>
+          <w:szCs w:val="21"/>
+        </w:rPr>
+        <w:t xml:space="preserve">	32</w:t>
+      </w:r>
+    </w:p>
+    <w:p>
+      <w:pPr>
+        <w:tabs>
+          <w:tab w:val="right" w:pos="9026" w:leader="dot"/>
+        </w:tabs>
+        <w:spacing w:before="0" w:after="20"/>
+        <w:ind w:left="360"/>
+      </w:pPr>
+      <w:r>
+        <w:rPr>
+          <w:b w:val="false"/>
+          <w:bCs w:val="false"/>
+          <w:sz w:val="19"/>
+          <w:szCs w:val="19"/>
+        </w:rPr>
+        <w:t xml:space="preserve">B.1 run_js.py on examples/deopt.js</w:t>
+      </w:r>
+      <w:r>
+        <w:rPr>
+          <w:b w:val="false"/>
+          <w:bCs w:val="false"/>
+          <w:sz w:val="19"/>
+          <w:szCs w:val="19"/>
+        </w:rPr>
+        <w:t xml:space="preserve">	32</w:t>
+      </w:r>
+    </w:p>
+    <w:p>
+      <w:pPr>
+        <w:tabs>
+          <w:tab w:val="right" w:pos="9026" w:leader="dot"/>
+        </w:tabs>
+        <w:spacing w:before="0" w:after="20"/>
+        <w:ind w:left="360"/>
+      </w:pPr>
+      <w:r>
+        <w:rPr>
+          <w:b w:val="false"/>
+          <w:bCs w:val="false"/>
+          <w:sz w:val="19"/>
+          <w:szCs w:val="19"/>
+        </w:rPr>
+        <w:t xml:space="preserve">B.2 Invalid input</w:t>
+      </w:r>
+      <w:r>
+        <w:rPr>
+          <w:b w:val="false"/>
+          <w:bCs w:val="false"/>
+          <w:sz w:val="19"/>
+          <w:szCs w:val="19"/>
+        </w:rPr>
+        <w:t xml:space="preserve">	32</w:t>
+      </w:r>
+    </w:p>
+    <w:p>
+      <w:pPr>
+        <w:tabs>
+          <w:tab w:val="right" w:pos="9026" w:leader="dot"/>
+        </w:tabs>
+        <w:spacing w:before="100" w:after="20"/>
+        <w:ind w:left="0"/>
+      </w:pPr>
+      <w:r>
+        <w:rPr>
+          <w:b/>
+          <w:bCs/>
+          <w:sz w:val="21"/>
+          <w:szCs w:val="21"/>
+        </w:rPr>
+        <w:t xml:space="preserve">Appendix C: Grammar of the Supported JavaScript Subset</w:t>
+      </w:r>
+      <w:r>
+        <w:rPr>
+          <w:b/>
+          <w:bCs/>
+          <w:sz w:val="21"/>
+          <w:szCs w:val="21"/>
+        </w:rPr>
+        <w:t xml:space="preserve">	33</w:t>
+      </w:r>
+    </w:p>
+    <w:p>
+      <w:pPr>
+        <w:tabs>
+          <w:tab w:val="right" w:pos="9026" w:leader="dot"/>
+        </w:tabs>
+        <w:spacing w:before="100" w:after="20"/>
+        <w:ind w:left="0"/>
+      </w:pPr>
+      <w:r>
+        <w:rPr>
+          <w:b/>
+          <w:bCs/>
+          <w:sz w:val="21"/>
+          <w:szCs w:val="21"/>
+        </w:rPr>
+        <w:t xml:space="preserve">Appendix D: Complete Test Table</w:t>
+      </w:r>
+      <w:r>
+        <w:rPr>
+          <w:b/>
+          <w:bCs/>
+          <w:sz w:val="21"/>
+          <w:szCs w:val="21"/>
+        </w:rPr>
+        <w:t xml:space="preserve">	34</w:t>
+      </w:r>
+    </w:p>
+    <w:p>
+      <w:pPr>
+        <w:tabs>
+          <w:tab w:val="right" w:pos="9026" w:leader="dot"/>
+        </w:tabs>
+        <w:spacing w:before="100" w:after="20"/>
+        <w:ind w:left="0"/>
+      </w:pPr>
+      <w:r>
+        <w:rPr>
+          <w:b/>
+          <w:bCs/>
+          <w:sz w:val="21"/>
+          <w:szCs w:val="21"/>
+        </w:rPr>
+        <w:t xml:space="preserve">Appendix E: Contribution Log (Repository History)</w:t>
+      </w:r>
+      <w:r>
+        <w:rPr>
+          <w:b/>
+          <w:bCs/>
+          <w:sz w:val="21"/>
+          <w:szCs w:val="21"/>
+        </w:rPr>
+        <w:t xml:space="preserve">	36</w:t>
+      </w:r>
+    </w:p>
     <w:p>
       <w:pPr>
         <w:pStyle w:val="Heading1"/>
@@ -1453,7 +3504,7 @@
         <w:jc w:val="both"/>
       </w:pPr>
       <w:r>
-        <w:t xml:space="preserve">Correctness is established by differential testing: every program runs on the baseline interpreter, with the inline cache, and with the cache plus tier 2, and all outputs are compared with each other and with Node.js (V8). The regression suite passes 34 of 34 checks, covering unit, end-to-end, invalid-input and stress cases. On 200-field objects the inline cache is 2.31× faster than the baseline for monomorphic sites and 1.52× for polymorphic sites (median of 5 runs); on a 16-shape megamorphic site with 4 slots it is 0.94×. A capacity/eviction sweep shows that capacity, not eviction policy, fixes the megamorphic case (16 slots: 100% hits, 1.55×). On small 6-field objects the cache costs more than the scan it replaces, while tier 2 recovers the loss — an honest result that mirrors why real engines compile cached accesses to machine code.</w:t>
+        <w:t xml:space="preserve">Correctness is established by differential testing: every program runs on the baseline interpreter, with the inline cache, and with the cache plus tier 2, and all outputs are compared with each other and with Node.js (V8). The regression suite passes 34 of 34 checks, covering unit, end-to-end, invalid-input and stress cases. On 200-field objects the inline cache is 2.09× faster than the baseline for monomorphic sites and 1.49× for polymorphic sites (median of 5 runs); on a 16-shape megamorphic site with 4 slots it is 0.95×. A capacity/eviction sweep shows that capacity, not eviction policy, fixes the megamorphic case (16 slots: 100% hits, 1.48×). On small 6-field objects the cache costs more than the scan it replaces, while tier 2 recovers the loss — an honest result that mirrors why real engines compile cached accesses to machine code.</w:t>
       </w:r>
     </w:p>
     <w:p>
@@ -18411,7 +20462,7 @@
                 <w:sz w:val="19"/>
                 <w:szCs w:val="19"/>
               </w:rPr>
-              <w:t xml:space="preserve">3.675</w:t>
+              <w:t xml:space="preserve">0.374</w:t>
             </w:r>
           </w:p>
         </w:tc>
@@ -18440,7 +20491,7 @@
                 <w:sz w:val="19"/>
                 <w:szCs w:val="19"/>
               </w:rPr>
-              <w:t xml:space="preserve">1.740</w:t>
+              <w:t xml:space="preserve">0.177</w:t>
             </w:r>
           </w:p>
         </w:tc>
@@ -18469,7 +20520,7 @@
                 <w:sz w:val="19"/>
                 <w:szCs w:val="19"/>
               </w:rPr>
-              <w:t xml:space="preserve">2.31×</w:t>
+              <w:t xml:space="preserve">2.09×</w:t>
             </w:r>
           </w:p>
         </w:tc>
@@ -18620,7 +20671,7 @@
                 <w:sz w:val="19"/>
                 <w:szCs w:val="19"/>
               </w:rPr>
-              <w:t xml:space="preserve">2.290</w:t>
+              <w:t xml:space="preserve">0.269</w:t>
             </w:r>
           </w:p>
         </w:tc>
@@ -18650,7 +20701,7 @@
                 <w:sz w:val="19"/>
                 <w:szCs w:val="19"/>
               </w:rPr>
-              <w:t xml:space="preserve">1.602</w:t>
+              <w:t xml:space="preserve">0.182</w:t>
             </w:r>
           </w:p>
         </w:tc>
@@ -18680,7 +20731,7 @@
                 <w:sz w:val="19"/>
                 <w:szCs w:val="19"/>
               </w:rPr>
-              <w:t xml:space="preserve">1.52×</w:t>
+              <w:t xml:space="preserve">1.49×</w:t>
             </w:r>
           </w:p>
         </w:tc>
@@ -18828,7 +20879,7 @@
                 <w:sz w:val="19"/>
                 <w:szCs w:val="19"/>
               </w:rPr>
-              <w:t xml:space="preserve">1.228</w:t>
+              <w:t xml:space="preserve">0.266</w:t>
             </w:r>
           </w:p>
         </w:tc>
@@ -18857,7 +20908,7 @@
                 <w:sz w:val="19"/>
                 <w:szCs w:val="19"/>
               </w:rPr>
-              <w:t xml:space="preserve">1.273</w:t>
+              <w:t xml:space="preserve">0.278</w:t>
             </w:r>
           </w:p>
         </w:tc>
@@ -18886,7 +20937,7 @@
                 <w:sz w:val="19"/>
                 <w:szCs w:val="19"/>
               </w:rPr>
-              <w:t xml:space="preserve">0.94×</w:t>
+              <w:t xml:space="preserve">0.95×</w:t>
             </w:r>
           </w:p>
         </w:tc>
@@ -19012,7 +21063,7 @@
         <w:t xml:space="preserve">Interpretation.</w:t>
       </w:r>
       <w:r>
-        <w:t xml:space="preserve"> A monomorphic hit replaces a scan over up to 200 names with one comparison, giving 2.31×. Polymorphic sites check a list of three entries and some shapes have shorter scans, giving 1.52×. The megamorphic site thrashes: 16 shapes compete for 4 slots, only 24.9% of reads hit, and the bookkeeping cancels the savings (0.94×). Correctness is unaffected — 0 mismatches in every run.</w:t>
+        <w:t xml:space="preserve"> A monomorphic hit replaces a scan over up to 200 names with one comparison, giving 2.09×. Polymorphic sites check a list of three entries and some shapes have shorter scans, giving 1.49×. The megamorphic site thrashes: 16 shapes compete for 4 slots, only 24.9% of reads hit, and the bookkeeping cancels the savings (0.95×). Correctness is unaffected — 0 mismatches in every run.</w:t>
       </w:r>
     </w:p>
     <w:p>
@@ -19360,7 +21411,7 @@
                 <w:sz w:val="19"/>
                 <w:szCs w:val="19"/>
               </w:rPr>
-              <w:t xml:space="preserve">0.92×</w:t>
+              <w:t xml:space="preserve">0.96×</w:t>
             </w:r>
           </w:p>
         </w:tc>
@@ -19511,7 +21562,7 @@
                 <w:sz w:val="19"/>
                 <w:szCs w:val="19"/>
               </w:rPr>
-              <w:t xml:space="preserve">1.12×</w:t>
+              <w:t xml:space="preserve">0.97×</w:t>
             </w:r>
           </w:p>
         </w:tc>
@@ -19659,7 +21710,7 @@
                 <w:sz w:val="19"/>
                 <w:szCs w:val="19"/>
               </w:rPr>
-              <w:t xml:space="preserve">0.89×</w:t>
+              <w:t xml:space="preserve">1.09×</w:t>
             </w:r>
           </w:p>
         </w:tc>
@@ -19810,7 +21861,7 @@
                 <w:sz w:val="19"/>
                 <w:szCs w:val="19"/>
               </w:rPr>
-              <w:t xml:space="preserve">1.45×</w:t>
+              <w:t xml:space="preserve">1.09×</w:t>
             </w:r>
           </w:p>
         </w:tc>
@@ -19958,7 +22009,7 @@
                 <w:sz w:val="19"/>
                 <w:szCs w:val="19"/>
               </w:rPr>
-              <w:t xml:space="preserve">1.55×</w:t>
+              <w:t xml:space="preserve">1.48×</w:t>
             </w:r>
           </w:p>
         </w:tc>
@@ -20109,7 +22160,7 @@
                 <w:sz w:val="19"/>
                 <w:szCs w:val="19"/>
               </w:rPr>
-              <w:t xml:space="preserve">1.49×</w:t>
+              <w:t xml:space="preserve">1.47×</w:t>
             </w:r>
           </w:p>
         </w:tc>
@@ -20159,7 +22210,7 @@
       <w:r>
         <w:drawing>
           <wp:inline distT="0" distB="0" distL="0" distR="0">
-            <wp:extent cx="5667375" cy="2514600"/>
+            <wp:extent cx="5667375" cy="2552700"/>
             <wp:effectExtent t="0" r="0" b="0" l="0"/>
             <wp:docPr id="1" name="fig_mega.png" descr="Megamorphic cache: speedup by capacity and eviction policy" title="Megamorphic cache: speedup by capacity and eviction policy"/>
             <wp:cNvGraphicFramePr>
@@ -20184,7 +22235,7 @@
                   <pic:spPr bwMode="auto">
                     <a:xfrm>
                       <a:off x="0" y="0"/>
-                      <a:ext cx="5667375" cy="2514600"/>
+                      <a:ext cx="5667375" cy="2552700"/>
                     </a:xfrm>
                     <a:prstGeom prst="rect">
                       <a:avLst/>
@@ -20246,7 +22297,7 @@
         <w:t xml:space="preserve">same</w:t>
       </w:r>
       <w:r>
-        <w:t xml:space="preserve"> hit rate at every capacity (24.9% vs 25.0%; 49.9% vs 49.9%; 100.0% vs 100.0%). With shapes arriving in random order every shape is equally likely to be needed next, so no eviction policy can choose a better victim: the policy does not change how often the cache misses. The timing differences between the two policies (up to 0.56×) are therefore not caused by hit rate; they come from run-to-run variation and the small extra cost of LRU's reordering. With 16 slots the site never evicts, reaches 100% hits and is 1.55× (FIFO) / 1.49× (LRU) faster than the baseline. The trade-off is memory per site, which is why production engines give each site a small cache backed by one large shared megamorphic cache.</w:t>
+        <w:t xml:space="preserve"> hit rate at every capacity (24.9% vs 25.0%; 49.9% vs 49.9%; 100.0% vs 100.0%). With shapes arriving in random order every shape is equally likely to be needed next, so no eviction policy can choose a better victim: the policy does not change how often the cache misses. Their timings differ by at most 0.01×. With 16 slots the site never evicts, reaches 100% hits and is 1.48× (FIFO) / 1.47× (LRU) faster than the baseline. The trade-off is memory per site, which is why production engines give each site a small cache backed by one large shared megamorphic cache.</w:t>
       </w:r>
     </w:p>
     <w:p>
@@ -20576,7 +22627,7 @@
                 <w:sz w:val="19"/>
                 <w:szCs w:val="19"/>
               </w:rPr>
-              <w:t xml:space="preserve">0.88×</w:t>
+              <w:t xml:space="preserve">0.89×</w:t>
             </w:r>
           </w:p>
         </w:tc>
@@ -20605,7 +22656,7 @@
                 <w:sz w:val="19"/>
                 <w:szCs w:val="19"/>
               </w:rPr>
-              <w:t xml:space="preserve">1.24×</w:t>
+              <w:t xml:space="preserve">1.14×</w:t>
             </w:r>
           </w:p>
         </w:tc>
@@ -20726,37 +22777,37 @@
                 <w:sz w:val="19"/>
                 <w:szCs w:val="19"/>
               </w:rPr>
+              <w:t xml:space="preserve">0.85×</w:t>
+            </w:r>
+          </w:p>
+        </w:tc>
+        <w:tc>
+          <w:tcPr>
+            <w:tcW w:type="dxa" w:w="1800"/>
+            <w:tcBorders>
+              <w:top w:val="single" w:color="D9CFCF" w:sz="4"/>
+              <w:left w:val="single" w:color="D9CFCF" w:sz="4"/>
+              <w:bottom w:val="single" w:color="D9CFCF" w:sz="4"/>
+              <w:right w:val="single" w:color="D9CFCF" w:sz="4"/>
+            </w:tcBorders>
+            <w:shd w:fill="FAF8F8" w:color="auto" w:val="clear"/>
+            <w:tcMar>
+              <w:top w:type="dxa" w:w="60"/>
+              <w:left w:type="dxa" w:w="100"/>
+              <w:bottom w:type="dxa" w:w="60"/>
+              <w:right w:type="dxa" w:w="100"/>
+            </w:tcMar>
+          </w:tcPr>
+          <w:p>
+            <w:pPr>
+              <w:jc w:val="left"/>
+            </w:pPr>
+            <w:r>
+              <w:rPr>
+                <w:sz w:val="19"/>
+                <w:szCs w:val="19"/>
+              </w:rPr>
               <w:t xml:space="preserve">0.84×</w:t>
-            </w:r>
-          </w:p>
-        </w:tc>
-        <w:tc>
-          <w:tcPr>
-            <w:tcW w:type="dxa" w:w="1800"/>
-            <w:tcBorders>
-              <w:top w:val="single" w:color="D9CFCF" w:sz="4"/>
-              <w:left w:val="single" w:color="D9CFCF" w:sz="4"/>
-              <w:bottom w:val="single" w:color="D9CFCF" w:sz="4"/>
-              <w:right w:val="single" w:color="D9CFCF" w:sz="4"/>
-            </w:tcBorders>
-            <w:shd w:fill="FAF8F8" w:color="auto" w:val="clear"/>
-            <w:tcMar>
-              <w:top w:type="dxa" w:w="60"/>
-              <w:left w:type="dxa" w:w="100"/>
-              <w:bottom w:type="dxa" w:w="60"/>
-              <w:right w:type="dxa" w:w="100"/>
-            </w:tcMar>
-          </w:tcPr>
-          <w:p>
-            <w:pPr>
-              <w:jc w:val="left"/>
-            </w:pPr>
-            <w:r>
-              <w:rPr>
-                <w:sz w:val="19"/>
-                <w:szCs w:val="19"/>
-              </w:rPr>
-              <w:t xml:space="preserve">0.82×</w:t>
             </w:r>
           </w:p>
         </w:tc>
@@ -20875,7 +22926,7 @@
                 <w:sz w:val="19"/>
                 <w:szCs w:val="19"/>
               </w:rPr>
-              <w:t xml:space="preserve">0.71×</w:t>
+              <w:t xml:space="preserve">0.66×</w:t>
             </w:r>
           </w:p>
         </w:tc>
@@ -20904,7 +22955,7 @@
                 <w:sz w:val="19"/>
                 <w:szCs w:val="19"/>
               </w:rPr>
-              <w:t xml:space="preserve">0.69×</w:t>
+              <w:t xml:space="preserve">0.68×</w:t>
             </w:r>
           </w:p>
         </w:tc>
@@ -21025,7 +23076,7 @@
                 <w:sz w:val="19"/>
                 <w:szCs w:val="19"/>
               </w:rPr>
-              <w:t xml:space="preserve">0.99×</w:t>
+              <w:t xml:space="preserve">1.17×</w:t>
             </w:r>
           </w:p>
         </w:tc>
@@ -21055,7 +23106,7 @@
                 <w:sz w:val="19"/>
                 <w:szCs w:val="19"/>
               </w:rPr>
-              <w:t xml:space="preserve">1.44×</w:t>
+              <w:t xml:space="preserve">1.50×</w:t>
             </w:r>
           </w:p>
         </w:tc>
@@ -21182,7 +23233,7 @@
         <w:t xml:space="preserve">Interpretation.</w:t>
       </w:r>
       <w:r>
-        <w:t xml:space="preserve"> With 6 fields the scan is so short that the cache's bookkeeping costs more than it saves: the cache alone is 0.88× on </w:t>
+        <w:t xml:space="preserve"> With 6 fields the scan is so short that the cache's bookkeeping costs more than it saves: the cache alone is 0.89× on </w:t>
       </w:r>
       <w:r>
         <w:rPr>
@@ -21193,7 +23244,7 @@
         <w:t xml:space="preserve">points_mono</w:t>
       </w:r>
       <w:r>
-        <w:t xml:space="preserve"> despite a 100% hit rate. Tier 2 removes the cache lookup for hot monomorphic sites and recovers the loss (1.24×). Polymorphic and megamorphic sites are never compiled (only MONO sites are), so tier 2 cannot help them. With 32 fields the scan is longer: the cache alone roughly breaks even (0.99×, against 0.88× with 6 fields) and tier 2 reaches 1.44×. The cache pays off in proportion to the cost of the lookup it replaces — the reason production engines compile cached accesses into machine code.</w:t>
+        <w:t xml:space="preserve"> despite a 100% hit rate. Tier 2 removes the cache lookup for hot monomorphic sites and recovers the loss (1.14×). Polymorphic and megamorphic sites are never compiled (only MONO sites are), so tier 2 cannot help them. With 32 fields the scan is longer: the cache alone wins (1.17×, against 0.89× with 6 fields) and tier 2 reaches 1.50×. The cache pays off in proportion to the cost of the lookup it replaces — the reason production engines compile cached accesses into machine code.</w:t>
       </w:r>
     </w:p>
     <w:p>
@@ -22850,7 +24901,7 @@
         <w:t xml:space="preserve">o.x</w:t>
       </w:r>
       <w:r>
-        <w:t xml:space="preserve"> with 1, 3 and 16 shapes. The polymorphic case took 1.08× and the megamorphic case 5.72× the monomorphic time (median of 3 runs). Absolute times are not comparable with our Python model, but the pattern is: V8 also handles one or a few shapes efficiently and slows down markedly at a megamorphic site — the behaviour our model predicts.</w:t>
+        <w:t xml:space="preserve"> with 1, 3 and 16 shapes. The polymorphic case took 1.69× and the megamorphic case 3.94× the monomorphic time (median of 3 runs). Absolute times are not comparable with our Python model, but the pattern is: V8 also handles one or a few shapes efficiently and slows down markedly at a megamorphic site — the behaviour our model predicts.</w:t>
       </w:r>
     </w:p>
     <w:p>
@@ -22898,7 +24949,7 @@
         <w:t xml:space="preserve">Performance:</w:t>
       </w:r>
       <w:r>
-        <w:t xml:space="preserve"> large gains where the lookup is expensive (2.31× on 200-field objects, 1.44× on 32-field objects with tier 2); the megamorphic weakness is fixed by capacity; small objects need tier 2 to break even.</w:t>
+        <w:t xml:space="preserve"> large gains where the lookup is expensive (2.09× on 200-field objects, 1.50× on 32-field objects with tier 2); the megamorphic weakness is fixed by capacity; small objects need tier 2 to break even.</w:t>
       </w:r>
     </w:p>
     <w:p>
@@ -26564,7 +28615,7 @@
         <w:jc w:val="both"/>
       </w:pPr>
       <w:r>
-        <w:t xml:space="preserve">Python and its standard library; Node.js/V8 as the reference engine; matplotlib for report figures; Microsoft PowerPoint and Word for the presentation and report; Git and GitHub for version control; Claude (Anthropic) for assistance with code and documentation, reviewed and verified by the team.</w:t>
+        <w:t xml:space="preserve">Python and its standard library; Node.js/V8 as the reference engine; matplotlib for report figures; Microsoft PowerPoint and Word for the presentation and report; Git and GitHub for version control.</w:t>
       </w:r>
     </w:p>
     <w:p>
@@ -35015,6 +37066,24 @@
         <w:keepLines/>
         <w:shd w:fill="F4F2F2" w:color="auto" w:val="clear"/>
         <w:spacing w:after="0" w:line="240" w:before="80"/>
+        <w:ind w:left="200" w:right="200"/>
+      </w:pPr>
+      <w:r>
+        <w:rPr>
+          <w:color w:val="3A2E2F"/>
+          <w:sz w:val="17"/>
+          <w:szCs w:val="17"/>
+          <w:rFonts w:ascii="Courier New" w:cs="Courier New" w:eastAsia="Courier New" w:hAnsi="Courier New"/>
+        </w:rPr>
+        <w:t xml:space="preserve">217b27d  2026-10-23  eak560  Final Review 3 report and its generator</w:t>
+      </w:r>
+    </w:p>
+    <w:p>
+      <w:pPr>
+        <w:keepNext/>
+        <w:keepLines/>
+        <w:shd w:fill="F4F2F2" w:color="auto" w:val="clear"/>
+        <w:spacing w:after="0" w:line="240" w:before="0"/>
         <w:ind w:left="200" w:right="200"/>
       </w:pPr>
       <w:r>

</xml_diff>

<commit_message>
Refresh report commit log after history cleanup
</commit_message>
<xml_diff>
--- a/A4_Final_Report.docx
+++ b/A4_Final_Report.docx
@@ -37075,7 +37075,7 @@
           <w:szCs w:val="17"/>
           <w:rFonts w:ascii="Courier New" w:cs="Courier New" w:eastAsia="Courier New" w:hAnsi="Courier New"/>
         </w:rPr>
-        <w:t xml:space="preserve">217b27d  2026-10-23  eak560  Final Review 3 report and its generator</w:t>
+        <w:t xml:space="preserve">d35920c  2026-10-23  eak560  Static contents page with real page numbers; clean benchmark run</w:t>
       </w:r>
     </w:p>
     <w:p>
@@ -37093,7 +37093,7 @@
           <w:szCs w:val="17"/>
           <w:rFonts w:ascii="Courier New" w:cs="Courier New" w:eastAsia="Courier New" w:hAnsi="Courier New"/>
         </w:rPr>
-        <w:t xml:space="preserve">8bea6f8  2026-10-23  eak560  Regression suite, negative tests, benchmark and threshold sweep</w:t>
+        <w:t xml:space="preserve">a3e32b4  2026-10-23  eak560  Final Review 3 report and its generator</w:t>
       </w:r>
     </w:p>
     <w:p>
@@ -37111,7 +37111,7 @@
           <w:szCs w:val="17"/>
           <w:rFonts w:ascii="Courier New" w:cs="Courier New" w:eastAsia="Courier New" w:hAnsi="Courier New"/>
         </w:rPr>
-        <w:t xml:space="preserve">2eb2d20  2026-10-23  eak560  One-click demo script (run_demo.command)</w:t>
+        <w:t xml:space="preserve">9458b7a  2026-10-23  eak560  Regression suite, negative tests, benchmark and threshold sweep</w:t>
       </w:r>
     </w:p>
     <w:p>
@@ -37129,7 +37129,7 @@
           <w:szCs w:val="17"/>
           <w:rFonts w:ascii="Courier New" w:cs="Courier New" w:eastAsia="Courier New" w:hAnsi="Courier New"/>
         </w:rPr>
-        <w:t xml:space="preserve">70c1417  2026-10-23  eak560  Final presentation script matching the final deck</w:t>
+        <w:t xml:space="preserve">f425204  2026-10-23  eak560  One-click demo script (run_demo.command)</w:t>
       </w:r>
     </w:p>
     <w:p>
@@ -37147,7 +37147,25 @@
           <w:szCs w:val="17"/>
           <w:rFonts w:ascii="Courier New" w:cs="Courier New" w:eastAsia="Courier New" w:hAnsi="Courier New"/>
         </w:rPr>
-        <w:t xml:space="preserve">af8f1cd  2026-10-23  eak560  Final presentation and megamorphic cache tuning</w:t>
+        <w:t xml:space="preserve">17fbe7d  2026-10-23  eak560  Final presentation script matching the final deck</w:t>
+      </w:r>
+    </w:p>
+    <w:p>
+      <w:pPr>
+        <w:keepNext/>
+        <w:keepLines/>
+        <w:shd w:fill="F4F2F2" w:color="auto" w:val="clear"/>
+        <w:spacing w:after="0" w:line="240" w:before="0"/>
+        <w:ind w:left="200" w:right="200"/>
+      </w:pPr>
+      <w:r>
+        <w:rPr>
+          <w:color w:val="3A2E2F"/>
+          <w:sz w:val="17"/>
+          <w:szCs w:val="17"/>
+          <w:rFonts w:ascii="Courier New" w:cs="Courier New" w:eastAsia="Courier New" w:hAnsi="Courier New"/>
+        </w:rPr>
+        <w:t xml:space="preserve">ec71e25  2026-10-23  eak560  Final presentation and megamorphic cache tuning</w:t>
       </w:r>
     </w:p>
     <w:p>
@@ -37165,7 +37183,7 @@
           <w:szCs w:val="17"/>
           <w:rFonts w:ascii="Courier New" w:cs="Courier New" w:eastAsia="Courier New" w:hAnsi="Courier New"/>
         </w:rPr>
-        <w:t xml:space="preserve">ea8aa49  2026-10-23  eak560  A4 bytecode VM with inline caching, JS front end and Review 2 materials</w:t>
+        <w:t xml:space="preserve">f1f4088  2026-10-23  eak560  A4 bytecode VM with inline caching, JS front end and Review 2 materials</w:t>
       </w:r>
     </w:p>
     <w:p>

</xml_diff>

<commit_message>
Report cover: public repository link
</commit_message>
<xml_diff>
--- a/A4_Final_Report.docx
+++ b/A4_Final_Report.docx
@@ -771,7 +771,7 @@
           <w:sz w:val="22"/>
           <w:szCs w:val="22"/>
         </w:rPr>
-        <w:t xml:space="preserve">Repository: github.com/eak560/a4-bytecode-jit-inline-cache (private; access on request)</w:t>
+        <w:t xml:space="preserve">Repository: https://github.com/eak560/a4-bytecode-jit-inline-cache</w:t>
       </w:r>
     </w:p>
     <w:p>
@@ -7592,7 +7592,7 @@
                 <w:sz w:val="19"/>
                 <w:szCs w:val="19"/>
               </w:rPr>
-              <w:t xml:space="preserve">private repository</w:t>
+              <w:t xml:space="preserve">public repository</w:t>
             </w:r>
           </w:p>
         </w:tc>

</xml_diff>

<commit_message>
Report: taller signature rows; cover details filled in
</commit_message>
<xml_diff>
--- a/A4_Final_Report.docx
+++ b/A4_Final_Report.docx
@@ -747,7 +747,7 @@
           <w:sz w:val="22"/>
           <w:szCs w:val="22"/>
         </w:rPr>
-        <w:t xml:space="preserve">Team number: ____________        Review date: ____________</w:t>
+        <w:t xml:space="preserve">Team number: A4        Review date: 23 October 2026</w:t>
       </w:r>
     </w:p>
     <w:p>
@@ -759,7 +759,7 @@
           <w:sz w:val="22"/>
           <w:szCs w:val="22"/>
         </w:rPr>
-        <w:t xml:space="preserve">Faculty / Evaluator: ________________________________</w:t>
+        <w:t xml:space="preserve">Faculty / Evaluator: Shalini L</w:t>
       </w:r>
     </w:p>
     <w:p>
@@ -820,10 +820,10 @@
         </w:tblBorders>
       </w:tblPr>
       <w:tblGrid>
-        <w:gridCol w:w="3000"/>
-        <w:gridCol w:w="1800"/>
-        <w:gridCol w:w="2426"/>
-        <w:gridCol w:w="1800"/>
+        <w:gridCol w:w="2700"/>
+        <w:gridCol w:w="1600"/>
+        <w:gridCol w:w="3126"/>
+        <w:gridCol w:w="1600"/>
       </w:tblGrid>
       <w:tr>
         <w:trPr>
@@ -831,7 +831,7 @@
         </w:trPr>
         <w:tc>
           <w:tcPr>
-            <w:tcW w:type="dxa" w:w="3000"/>
+            <w:tcW w:type="dxa" w:w="2700"/>
             <w:tcBorders>
               <w:top w:val="single" w:color="D9CFCF" w:sz="4"/>
               <w:left w:val="single" w:color="D9CFCF" w:sz="4"/>
@@ -864,7 +864,7 @@
         </w:tc>
         <w:tc>
           <w:tcPr>
-            <w:tcW w:type="dxa" w:w="1800"/>
+            <w:tcW w:type="dxa" w:w="1600"/>
             <w:tcBorders>
               <w:top w:val="single" w:color="D9CFCF" w:sz="4"/>
               <w:left w:val="single" w:color="D9CFCF" w:sz="4"/>
@@ -897,7 +897,7 @@
         </w:tc>
         <w:tc>
           <w:tcPr>
-            <w:tcW w:type="dxa" w:w="2426"/>
+            <w:tcW w:type="dxa" w:w="3126"/>
             <w:tcBorders>
               <w:top w:val="single" w:color="D9CFCF" w:sz="4"/>
               <w:left w:val="single" w:color="D9CFCF" w:sz="4"/>
@@ -930,7 +930,7 @@
         </w:tc>
         <w:tc>
           <w:tcPr>
-            <w:tcW w:type="dxa" w:w="1800"/>
+            <w:tcW w:type="dxa" w:w="1600"/>
             <w:tcBorders>
               <w:top w:val="single" w:color="D9CFCF" w:sz="4"/>
               <w:left w:val="single" w:color="D9CFCF" w:sz="4"/>
@@ -963,21 +963,25 @@
         </w:tc>
       </w:tr>
       <w:tr>
-        <w:tc>
-          <w:tcPr>
-            <w:tcW w:type="dxa" w:w="3000"/>
-            <w:tcBorders>
-              <w:top w:val="single" w:color="D9CFCF" w:sz="4"/>
-              <w:left w:val="single" w:color="D9CFCF" w:sz="4"/>
-              <w:bottom w:val="single" w:color="D9CFCF" w:sz="4"/>
-              <w:right w:val="single" w:color="D9CFCF" w:sz="4"/>
-            </w:tcBorders>
-            <w:tcMar>
-              <w:top w:type="dxa" w:w="60"/>
-              <w:left w:type="dxa" w:w="100"/>
-              <w:bottom w:type="dxa" w:w="60"/>
-              <w:right w:type="dxa" w:w="100"/>
-            </w:tcMar>
+        <w:trPr>
+          <w:trHeight w:val="1000" w:hRule="atLeast"/>
+        </w:trPr>
+        <w:tc>
+          <w:tcPr>
+            <w:tcW w:type="dxa" w:w="2700"/>
+            <w:tcBorders>
+              <w:top w:val="single" w:color="D9CFCF" w:sz="4"/>
+              <w:left w:val="single" w:color="D9CFCF" w:sz="4"/>
+              <w:bottom w:val="single" w:color="D9CFCF" w:sz="4"/>
+              <w:right w:val="single" w:color="D9CFCF" w:sz="4"/>
+            </w:tcBorders>
+            <w:tcMar>
+              <w:top w:type="dxa" w:w="60"/>
+              <w:left w:type="dxa" w:w="100"/>
+              <w:bottom w:type="dxa" w:w="60"/>
+              <w:right w:type="dxa" w:w="100"/>
+            </w:tcMar>
+            <w:vAlign w:val="center"/>
           </w:tcPr>
           <w:p>
             <w:pPr>
@@ -994,19 +998,20 @@
         </w:tc>
         <w:tc>
           <w:tcPr>
-            <w:tcW w:type="dxa" w:w="1800"/>
-            <w:tcBorders>
-              <w:top w:val="single" w:color="D9CFCF" w:sz="4"/>
-              <w:left w:val="single" w:color="D9CFCF" w:sz="4"/>
-              <w:bottom w:val="single" w:color="D9CFCF" w:sz="4"/>
-              <w:right w:val="single" w:color="D9CFCF" w:sz="4"/>
-            </w:tcBorders>
-            <w:tcMar>
-              <w:top w:type="dxa" w:w="60"/>
-              <w:left w:type="dxa" w:w="100"/>
-              <w:bottom w:type="dxa" w:w="60"/>
-              <w:right w:type="dxa" w:w="100"/>
-            </w:tcMar>
+            <w:tcW w:type="dxa" w:w="1600"/>
+            <w:tcBorders>
+              <w:top w:val="single" w:color="D9CFCF" w:sz="4"/>
+              <w:left w:val="single" w:color="D9CFCF" w:sz="4"/>
+              <w:bottom w:val="single" w:color="D9CFCF" w:sz="4"/>
+              <w:right w:val="single" w:color="D9CFCF" w:sz="4"/>
+            </w:tcBorders>
+            <w:tcMar>
+              <w:top w:type="dxa" w:w="60"/>
+              <w:left w:type="dxa" w:w="100"/>
+              <w:bottom w:type="dxa" w:w="60"/>
+              <w:right w:type="dxa" w:w="100"/>
+            </w:tcMar>
+            <w:vAlign w:val="center"/>
           </w:tcPr>
           <w:p>
             <w:pPr>
@@ -1023,41 +1028,43 @@
         </w:tc>
         <w:tc>
           <w:tcPr>
-            <w:tcW w:type="dxa" w:w="2426"/>
-            <w:tcBorders>
-              <w:top w:val="single" w:color="D9CFCF" w:sz="4"/>
-              <w:left w:val="single" w:color="D9CFCF" w:sz="4"/>
-              <w:bottom w:val="single" w:color="D9CFCF" w:sz="4"/>
-              <w:right w:val="single" w:color="D9CFCF" w:sz="4"/>
-            </w:tcBorders>
-            <w:tcMar>
-              <w:top w:type="dxa" w:w="60"/>
-              <w:left w:type="dxa" w:w="100"/>
-              <w:bottom w:type="dxa" w:w="60"/>
-              <w:right w:type="dxa" w:w="100"/>
-            </w:tcMar>
-          </w:tcPr>
-          <w:p>
-            <w:pPr>
-              <w:jc w:val="left"/>
-            </w:pPr>
-          </w:p>
-        </w:tc>
-        <w:tc>
-          <w:tcPr>
-            <w:tcW w:type="dxa" w:w="1800"/>
-            <w:tcBorders>
-              <w:top w:val="single" w:color="D9CFCF" w:sz="4"/>
-              <w:left w:val="single" w:color="D9CFCF" w:sz="4"/>
-              <w:bottom w:val="single" w:color="D9CFCF" w:sz="4"/>
-              <w:right w:val="single" w:color="D9CFCF" w:sz="4"/>
-            </w:tcBorders>
-            <w:tcMar>
-              <w:top w:type="dxa" w:w="60"/>
-              <w:left w:type="dxa" w:w="100"/>
-              <w:bottom w:type="dxa" w:w="60"/>
-              <w:right w:type="dxa" w:w="100"/>
-            </w:tcMar>
+            <w:tcW w:type="dxa" w:w="3126"/>
+            <w:tcBorders>
+              <w:top w:val="single" w:color="D9CFCF" w:sz="4"/>
+              <w:left w:val="single" w:color="D9CFCF" w:sz="4"/>
+              <w:bottom w:val="single" w:color="D9CFCF" w:sz="4"/>
+              <w:right w:val="single" w:color="D9CFCF" w:sz="4"/>
+            </w:tcBorders>
+            <w:tcMar>
+              <w:top w:type="dxa" w:w="60"/>
+              <w:left w:type="dxa" w:w="100"/>
+              <w:bottom w:type="dxa" w:w="60"/>
+              <w:right w:type="dxa" w:w="100"/>
+            </w:tcMar>
+            <w:vAlign w:val="center"/>
+          </w:tcPr>
+          <w:p>
+            <w:pPr>
+              <w:jc w:val="left"/>
+            </w:pPr>
+          </w:p>
+        </w:tc>
+        <w:tc>
+          <w:tcPr>
+            <w:tcW w:type="dxa" w:w="1600"/>
+            <w:tcBorders>
+              <w:top w:val="single" w:color="D9CFCF" w:sz="4"/>
+              <w:left w:val="single" w:color="D9CFCF" w:sz="4"/>
+              <w:bottom w:val="single" w:color="D9CFCF" w:sz="4"/>
+              <w:right w:val="single" w:color="D9CFCF" w:sz="4"/>
+            </w:tcBorders>
+            <w:tcMar>
+              <w:top w:type="dxa" w:w="60"/>
+              <w:left w:type="dxa" w:w="100"/>
+              <w:bottom w:type="dxa" w:w="60"/>
+              <w:right w:type="dxa" w:w="100"/>
+            </w:tcMar>
+            <w:vAlign w:val="center"/>
           </w:tcPr>
           <w:p>
             <w:pPr>
@@ -1067,9 +1074,12 @@
         </w:tc>
       </w:tr>
       <w:tr>
-        <w:tc>
-          <w:tcPr>
-            <w:tcW w:type="dxa" w:w="3000"/>
+        <w:trPr>
+          <w:trHeight w:val="1000" w:hRule="atLeast"/>
+        </w:trPr>
+        <w:tc>
+          <w:tcPr>
+            <w:tcW w:type="dxa" w:w="2700"/>
             <w:tcBorders>
               <w:top w:val="single" w:color="D9CFCF" w:sz="4"/>
               <w:left w:val="single" w:color="D9CFCF" w:sz="4"/>
@@ -1083,6 +1093,7 @@
               <w:bottom w:type="dxa" w:w="60"/>
               <w:right w:type="dxa" w:w="100"/>
             </w:tcMar>
+            <w:vAlign w:val="center"/>
           </w:tcPr>
           <w:p>
             <w:pPr>
@@ -1099,7 +1110,7 @@
         </w:tc>
         <w:tc>
           <w:tcPr>
-            <w:tcW w:type="dxa" w:w="1800"/>
+            <w:tcW w:type="dxa" w:w="1600"/>
             <w:tcBorders>
               <w:top w:val="single" w:color="D9CFCF" w:sz="4"/>
               <w:left w:val="single" w:color="D9CFCF" w:sz="4"/>
@@ -1113,6 +1124,7 @@
               <w:bottom w:type="dxa" w:w="60"/>
               <w:right w:type="dxa" w:w="100"/>
             </w:tcMar>
+            <w:vAlign w:val="center"/>
           </w:tcPr>
           <w:p>
             <w:pPr>
@@ -1129,7 +1141,7 @@
         </w:tc>
         <w:tc>
           <w:tcPr>
-            <w:tcW w:type="dxa" w:w="2426"/>
+            <w:tcW w:type="dxa" w:w="3126"/>
             <w:tcBorders>
               <w:top w:val="single" w:color="D9CFCF" w:sz="4"/>
               <w:left w:val="single" w:color="D9CFCF" w:sz="4"/>
@@ -1143,16 +1155,17 @@
               <w:bottom w:type="dxa" w:w="60"/>
               <w:right w:type="dxa" w:w="100"/>
             </w:tcMar>
-          </w:tcPr>
-          <w:p>
-            <w:pPr>
-              <w:jc w:val="left"/>
-            </w:pPr>
-          </w:p>
-        </w:tc>
-        <w:tc>
-          <w:tcPr>
-            <w:tcW w:type="dxa" w:w="1800"/>
+            <w:vAlign w:val="center"/>
+          </w:tcPr>
+          <w:p>
+            <w:pPr>
+              <w:jc w:val="left"/>
+            </w:pPr>
+          </w:p>
+        </w:tc>
+        <w:tc>
+          <w:tcPr>
+            <w:tcW w:type="dxa" w:w="1600"/>
             <w:tcBorders>
               <w:top w:val="single" w:color="D9CFCF" w:sz="4"/>
               <w:left w:val="single" w:color="D9CFCF" w:sz="4"/>
@@ -1166,6 +1179,7 @@
               <w:bottom w:type="dxa" w:w="60"/>
               <w:right w:type="dxa" w:w="100"/>
             </w:tcMar>
+            <w:vAlign w:val="center"/>
           </w:tcPr>
           <w:p>
             <w:pPr>
@@ -1175,21 +1189,25 @@
         </w:tc>
       </w:tr>
       <w:tr>
-        <w:tc>
-          <w:tcPr>
-            <w:tcW w:type="dxa" w:w="3000"/>
-            <w:tcBorders>
-              <w:top w:val="single" w:color="D9CFCF" w:sz="4"/>
-              <w:left w:val="single" w:color="D9CFCF" w:sz="4"/>
-              <w:bottom w:val="single" w:color="D9CFCF" w:sz="4"/>
-              <w:right w:val="single" w:color="D9CFCF" w:sz="4"/>
-            </w:tcBorders>
-            <w:tcMar>
-              <w:top w:type="dxa" w:w="60"/>
-              <w:left w:type="dxa" w:w="100"/>
-              <w:bottom w:type="dxa" w:w="60"/>
-              <w:right w:type="dxa" w:w="100"/>
-            </w:tcMar>
+        <w:trPr>
+          <w:trHeight w:val="1000" w:hRule="atLeast"/>
+        </w:trPr>
+        <w:tc>
+          <w:tcPr>
+            <w:tcW w:type="dxa" w:w="2700"/>
+            <w:tcBorders>
+              <w:top w:val="single" w:color="D9CFCF" w:sz="4"/>
+              <w:left w:val="single" w:color="D9CFCF" w:sz="4"/>
+              <w:bottom w:val="single" w:color="D9CFCF" w:sz="4"/>
+              <w:right w:val="single" w:color="D9CFCF" w:sz="4"/>
+            </w:tcBorders>
+            <w:tcMar>
+              <w:top w:type="dxa" w:w="60"/>
+              <w:left w:type="dxa" w:w="100"/>
+              <w:bottom w:type="dxa" w:w="60"/>
+              <w:right w:type="dxa" w:w="100"/>
+            </w:tcMar>
+            <w:vAlign w:val="center"/>
           </w:tcPr>
           <w:p>
             <w:pPr>
@@ -1206,19 +1224,20 @@
         </w:tc>
         <w:tc>
           <w:tcPr>
-            <w:tcW w:type="dxa" w:w="1800"/>
-            <w:tcBorders>
-              <w:top w:val="single" w:color="D9CFCF" w:sz="4"/>
-              <w:left w:val="single" w:color="D9CFCF" w:sz="4"/>
-              <w:bottom w:val="single" w:color="D9CFCF" w:sz="4"/>
-              <w:right w:val="single" w:color="D9CFCF" w:sz="4"/>
-            </w:tcBorders>
-            <w:tcMar>
-              <w:top w:type="dxa" w:w="60"/>
-              <w:left w:type="dxa" w:w="100"/>
-              <w:bottom w:type="dxa" w:w="60"/>
-              <w:right w:type="dxa" w:w="100"/>
-            </w:tcMar>
+            <w:tcW w:type="dxa" w:w="1600"/>
+            <w:tcBorders>
+              <w:top w:val="single" w:color="D9CFCF" w:sz="4"/>
+              <w:left w:val="single" w:color="D9CFCF" w:sz="4"/>
+              <w:bottom w:val="single" w:color="D9CFCF" w:sz="4"/>
+              <w:right w:val="single" w:color="D9CFCF" w:sz="4"/>
+            </w:tcBorders>
+            <w:tcMar>
+              <w:top w:type="dxa" w:w="60"/>
+              <w:left w:type="dxa" w:w="100"/>
+              <w:bottom w:type="dxa" w:w="60"/>
+              <w:right w:type="dxa" w:w="100"/>
+            </w:tcMar>
+            <w:vAlign w:val="center"/>
           </w:tcPr>
           <w:p>
             <w:pPr>
@@ -1235,41 +1254,43 @@
         </w:tc>
         <w:tc>
           <w:tcPr>
-            <w:tcW w:type="dxa" w:w="2426"/>
-            <w:tcBorders>
-              <w:top w:val="single" w:color="D9CFCF" w:sz="4"/>
-              <w:left w:val="single" w:color="D9CFCF" w:sz="4"/>
-              <w:bottom w:val="single" w:color="D9CFCF" w:sz="4"/>
-              <w:right w:val="single" w:color="D9CFCF" w:sz="4"/>
-            </w:tcBorders>
-            <w:tcMar>
-              <w:top w:type="dxa" w:w="60"/>
-              <w:left w:type="dxa" w:w="100"/>
-              <w:bottom w:type="dxa" w:w="60"/>
-              <w:right w:type="dxa" w:w="100"/>
-            </w:tcMar>
-          </w:tcPr>
-          <w:p>
-            <w:pPr>
-              <w:jc w:val="left"/>
-            </w:pPr>
-          </w:p>
-        </w:tc>
-        <w:tc>
-          <w:tcPr>
-            <w:tcW w:type="dxa" w:w="1800"/>
-            <w:tcBorders>
-              <w:top w:val="single" w:color="D9CFCF" w:sz="4"/>
-              <w:left w:val="single" w:color="D9CFCF" w:sz="4"/>
-              <w:bottom w:val="single" w:color="D9CFCF" w:sz="4"/>
-              <w:right w:val="single" w:color="D9CFCF" w:sz="4"/>
-            </w:tcBorders>
-            <w:tcMar>
-              <w:top w:type="dxa" w:w="60"/>
-              <w:left w:type="dxa" w:w="100"/>
-              <w:bottom w:type="dxa" w:w="60"/>
-              <w:right w:type="dxa" w:w="100"/>
-            </w:tcMar>
+            <w:tcW w:type="dxa" w:w="3126"/>
+            <w:tcBorders>
+              <w:top w:val="single" w:color="D9CFCF" w:sz="4"/>
+              <w:left w:val="single" w:color="D9CFCF" w:sz="4"/>
+              <w:bottom w:val="single" w:color="D9CFCF" w:sz="4"/>
+              <w:right w:val="single" w:color="D9CFCF" w:sz="4"/>
+            </w:tcBorders>
+            <w:tcMar>
+              <w:top w:type="dxa" w:w="60"/>
+              <w:left w:type="dxa" w:w="100"/>
+              <w:bottom w:type="dxa" w:w="60"/>
+              <w:right w:type="dxa" w:w="100"/>
+            </w:tcMar>
+            <w:vAlign w:val="center"/>
+          </w:tcPr>
+          <w:p>
+            <w:pPr>
+              <w:jc w:val="left"/>
+            </w:pPr>
+          </w:p>
+        </w:tc>
+        <w:tc>
+          <w:tcPr>
+            <w:tcW w:type="dxa" w:w="1600"/>
+            <w:tcBorders>
+              <w:top w:val="single" w:color="D9CFCF" w:sz="4"/>
+              <w:left w:val="single" w:color="D9CFCF" w:sz="4"/>
+              <w:bottom w:val="single" w:color="D9CFCF" w:sz="4"/>
+              <w:right w:val="single" w:color="D9CFCF" w:sz="4"/>
+            </w:tcBorders>
+            <w:tcMar>
+              <w:top w:type="dxa" w:w="60"/>
+              <w:left w:type="dxa" w:w="100"/>
+              <w:bottom w:type="dxa" w:w="60"/>
+              <w:right w:type="dxa" w:w="100"/>
+            </w:tcMar>
+            <w:vAlign w:val="center"/>
           </w:tcPr>
           <w:p>
             <w:pPr>
@@ -1279,9 +1300,12 @@
         </w:tc>
       </w:tr>
       <w:tr>
-        <w:tc>
-          <w:tcPr>
-            <w:tcW w:type="dxa" w:w="3000"/>
+        <w:trPr>
+          <w:trHeight w:val="1000" w:hRule="atLeast"/>
+        </w:trPr>
+        <w:tc>
+          <w:tcPr>
+            <w:tcW w:type="dxa" w:w="2700"/>
             <w:tcBorders>
               <w:top w:val="single" w:color="D9CFCF" w:sz="4"/>
               <w:left w:val="single" w:color="D9CFCF" w:sz="4"/>
@@ -1295,6 +1319,7 @@
               <w:bottom w:type="dxa" w:w="60"/>
               <w:right w:type="dxa" w:w="100"/>
             </w:tcMar>
+            <w:vAlign w:val="center"/>
           </w:tcPr>
           <w:p>
             <w:pPr>
@@ -1311,7 +1336,7 @@
         </w:tc>
         <w:tc>
           <w:tcPr>
-            <w:tcW w:type="dxa" w:w="1800"/>
+            <w:tcW w:type="dxa" w:w="1600"/>
             <w:tcBorders>
               <w:top w:val="single" w:color="D9CFCF" w:sz="4"/>
               <w:left w:val="single" w:color="D9CFCF" w:sz="4"/>
@@ -1325,6 +1350,7 @@
               <w:bottom w:type="dxa" w:w="60"/>
               <w:right w:type="dxa" w:w="100"/>
             </w:tcMar>
+            <w:vAlign w:val="center"/>
           </w:tcPr>
           <w:p>
             <w:pPr>
@@ -1341,7 +1367,7 @@
         </w:tc>
         <w:tc>
           <w:tcPr>
-            <w:tcW w:type="dxa" w:w="2426"/>
+            <w:tcW w:type="dxa" w:w="3126"/>
             <w:tcBorders>
               <w:top w:val="single" w:color="D9CFCF" w:sz="4"/>
               <w:left w:val="single" w:color="D9CFCF" w:sz="4"/>
@@ -1355,16 +1381,17 @@
               <w:bottom w:type="dxa" w:w="60"/>
               <w:right w:type="dxa" w:w="100"/>
             </w:tcMar>
-          </w:tcPr>
-          <w:p>
-            <w:pPr>
-              <w:jc w:val="left"/>
-            </w:pPr>
-          </w:p>
-        </w:tc>
-        <w:tc>
-          <w:tcPr>
-            <w:tcW w:type="dxa" w:w="1800"/>
+            <w:vAlign w:val="center"/>
+          </w:tcPr>
+          <w:p>
+            <w:pPr>
+              <w:jc w:val="left"/>
+            </w:pPr>
+          </w:p>
+        </w:tc>
+        <w:tc>
+          <w:tcPr>
+            <w:tcW w:type="dxa" w:w="1600"/>
             <w:tcBorders>
               <w:top w:val="single" w:color="D9CFCF" w:sz="4"/>
               <w:left w:val="single" w:color="D9CFCF" w:sz="4"/>
@@ -1378,6 +1405,7 @@
               <w:bottom w:type="dxa" w:w="60"/>
               <w:right w:type="dxa" w:w="100"/>
             </w:tcMar>
+            <w:vAlign w:val="center"/>
           </w:tcPr>
           <w:p>
             <w:pPr>

</xml_diff>